<commit_message>
developing the report lab0
</commit_message>
<xml_diff>
--- a/Lab-0-Report.docx
+++ b/Lab-0-Report.docx
@@ -4,208 +4,1303 @@
   <w:body>
     <w:p>
       <w:pPr>
-        <w:rPr>
-          <w:lang w:val="en-US"/>
-        </w:rPr>
-      </w:pPr>
-    </w:p>
-    <w:p>
-      <w:pPr>
-        <w:rPr>
-          <w:b/>
-          <w:bCs/>
-          <w:lang w:val="en-US"/>
-        </w:rPr>
-      </w:pPr>
-      <w:r>
-        <w:rPr>
-          <w:b/>
-          <w:bCs/>
-          <w:lang w:val="en-US"/>
-        </w:rPr>
-        <w:t xml:space="preserve">Lab 0 Report: Setting </w:t>
-      </w:r>
-      <w:proofErr w:type="gramStart"/>
-      <w:r>
-        <w:rPr>
-          <w:b/>
-          <w:bCs/>
-          <w:lang w:val="en-US"/>
-        </w:rPr>
-        <w:t>Up</w:t>
-      </w:r>
-      <w:proofErr w:type="gramEnd"/>
-      <w:r>
-        <w:rPr>
-          <w:b/>
-          <w:bCs/>
-          <w:lang w:val="en-US"/>
+        <w:jc w:val="center"/>
+        <w:rPr>
+          <w:lang w:val="en-US"/>
+        </w:rPr>
+      </w:pPr>
+    </w:p>
+    <w:p>
+      <w:pPr>
+        <w:jc w:val="center"/>
+        <w:rPr>
+          <w:lang w:val="en-US"/>
+        </w:rPr>
+      </w:pPr>
+    </w:p>
+    <w:p>
+      <w:pPr>
+        <w:jc w:val="center"/>
+        <w:rPr>
+          <w:lang w:val="en-US"/>
+        </w:rPr>
+      </w:pPr>
+      <w:r>
+        <w:rPr>
+          <w:lang w:val="en-US"/>
+        </w:rPr>
+        <w:drawing>
+          <wp:inline distT="0" distB="0" distL="0" distR="0" wp14:anchorId="7AC4F4F3" wp14:editId="15A23A41">
+            <wp:extent cx="2009682" cy="1631315"/>
+            <wp:effectExtent l="0" t="0" r="0" b="6985"/>
+            <wp:docPr id="1" name="Picture 1"/>
+            <wp:cNvGraphicFramePr>
+              <a:graphicFrameLocks xmlns:a="http://schemas.openxmlformats.org/drawingml/2006/main" noChangeAspect="1"/>
+            </wp:cNvGraphicFramePr>
+            <a:graphic xmlns:a="http://schemas.openxmlformats.org/drawingml/2006/main">
+              <a:graphicData uri="http://schemas.openxmlformats.org/drawingml/2006/picture">
+                <pic:pic xmlns:pic="http://schemas.openxmlformats.org/drawingml/2006/picture">
+                  <pic:nvPicPr>
+                    <pic:cNvPr id="1" name=""/>
+                    <pic:cNvPicPr/>
+                  </pic:nvPicPr>
+                  <pic:blipFill rotWithShape="1">
+                    <a:blip r:embed="rId5"/>
+                    <a:srcRect/>
+                    <a:stretch/>
+                  </pic:blipFill>
+                  <pic:spPr bwMode="auto">
+                    <a:xfrm>
+                      <a:off x="0" y="0"/>
+                      <a:ext cx="2036590" cy="1653157"/>
+                    </a:xfrm>
+                    <a:prstGeom prst="rect">
+                      <a:avLst/>
+                    </a:prstGeom>
+                    <a:ln>
+                      <a:noFill/>
+                    </a:ln>
+                    <a:extLst>
+                      <a:ext uri="{53640926-AAD7-44D8-BBD7-CCE9431645EC}">
+                        <a14:shadowObscured xmlns:a14="http://schemas.microsoft.com/office/drawing/2010/main"/>
+                      </a:ext>
+                    </a:extLst>
+                  </pic:spPr>
+                </pic:pic>
+              </a:graphicData>
+            </a:graphic>
+          </wp:inline>
+        </w:drawing>
+      </w:r>
+    </w:p>
+    <w:p>
+      <w:pPr>
+        <w:spacing w:line="360" w:lineRule="auto"/>
+        <w:jc w:val="center"/>
+        <w:rPr>
+          <w:rFonts w:ascii="Times New Roman" w:hAnsi="Times New Roman" w:cs="Times New Roman"/>
+          <w:sz w:val="28"/>
+          <w:szCs w:val="28"/>
+        </w:rPr>
+      </w:pPr>
+      <w:r>
+        <w:rPr>
+          <w:rFonts w:ascii="Times New Roman" w:hAnsi="Times New Roman" w:cs="Times New Roman"/>
+          <w:b/>
+          <w:bCs/>
+          <w:sz w:val="28"/>
+          <w:szCs w:val="28"/>
+        </w:rPr>
+        <w:t>MAKERERE UNIVERSITY</w:t>
+      </w:r>
+    </w:p>
+    <w:p>
+      <w:pPr>
+        <w:spacing w:line="360" w:lineRule="auto"/>
+        <w:jc w:val="center"/>
+        <w:rPr>
+          <w:rFonts w:ascii="Times New Roman" w:hAnsi="Times New Roman" w:cs="Times New Roman"/>
+          <w:b/>
+          <w:bCs/>
+          <w:sz w:val="28"/>
+          <w:szCs w:val="28"/>
+        </w:rPr>
+      </w:pPr>
+      <w:r>
+        <w:rPr>
+          <w:rFonts w:ascii="Times New Roman" w:hAnsi="Times New Roman" w:cs="Times New Roman"/>
+          <w:b/>
+          <w:bCs/>
+          <w:sz w:val="28"/>
+          <w:szCs w:val="28"/>
+        </w:rPr>
+        <w:t>COLLEGE OF COMPUTING AND INFORMATICS TECHNOLOGY</w:t>
+      </w:r>
+    </w:p>
+    <w:p>
+      <w:pPr>
+        <w:spacing w:line="360" w:lineRule="auto"/>
+        <w:jc w:val="center"/>
+        <w:rPr>
+          <w:rFonts w:ascii="Times New Roman" w:hAnsi="Times New Roman" w:cs="Times New Roman"/>
+          <w:b/>
+          <w:bCs/>
+          <w:sz w:val="28"/>
+          <w:szCs w:val="28"/>
+        </w:rPr>
+      </w:pPr>
+      <w:r>
+        <w:rPr>
+          <w:rFonts w:ascii="Times New Roman" w:hAnsi="Times New Roman" w:cs="Times New Roman"/>
+          <w:b/>
+          <w:bCs/>
+          <w:sz w:val="28"/>
+          <w:szCs w:val="28"/>
+        </w:rPr>
+        <w:t>DEPARTMENT OF COMPUTER SCIENCE</w:t>
+      </w:r>
+    </w:p>
+    <w:p>
+      <w:pPr>
+        <w:spacing w:line="360" w:lineRule="auto"/>
+        <w:jc w:val="center"/>
+        <w:rPr>
+          <w:rFonts w:ascii="Times New Roman" w:hAnsi="Times New Roman" w:cs="Times New Roman"/>
+          <w:sz w:val="28"/>
+          <w:szCs w:val="28"/>
+          <w:lang w:val="en-US"/>
+        </w:rPr>
+      </w:pPr>
+      <w:r>
+        <w:rPr>
+          <w:rFonts w:ascii="Times New Roman" w:hAnsi="Times New Roman" w:cs="Times New Roman"/>
+          <w:b/>
+          <w:bCs/>
+          <w:sz w:val="28"/>
+          <w:szCs w:val="28"/>
+        </w:rPr>
+        <w:t>COURSE:</w:t>
+      </w:r>
+      <w:r>
+        <w:rPr>
+          <w:rFonts w:ascii="Times New Roman" w:hAnsi="Times New Roman" w:cs="Times New Roman"/>
+          <w:sz w:val="28"/>
+          <w:szCs w:val="28"/>
         </w:rPr>
         <w:t xml:space="preserve"> </w:t>
       </w:r>
-      <w:proofErr w:type="spellStart"/>
-      <w:r>
-        <w:rPr>
-          <w:b/>
-          <w:bCs/>
-          <w:lang w:val="en-US"/>
-        </w:rPr>
-        <w:t>CloudLab</w:t>
-      </w:r>
-      <w:proofErr w:type="spellEnd"/>
-      <w:r>
-        <w:rPr>
-          <w:b/>
-          <w:bCs/>
-          <w:lang w:val="en-US"/>
-        </w:rPr>
-        <w:t xml:space="preserve"> Environment</w:t>
-      </w:r>
-    </w:p>
-    <w:p>
-      <w:pPr>
-        <w:rPr>
-          <w:b/>
-          <w:bCs/>
-          <w:lang w:val="en-US"/>
-        </w:rPr>
-      </w:pPr>
-      <w:r>
-        <w:rPr>
-          <w:b/>
-          <w:bCs/>
-          <w:lang w:val="en-US"/>
-        </w:rPr>
-        <w:t>Introduction</w:t>
-      </w:r>
-    </w:p>
-    <w:p>
-      <w:pPr>
-        <w:rPr>
-          <w:lang w:val="en-US"/>
-        </w:rPr>
-      </w:pPr>
-      <w:r>
-        <w:rPr>
-          <w:lang w:val="en-US"/>
-        </w:rPr>
-        <w:t xml:space="preserve">This lab </w:t>
-      </w:r>
-      <w:proofErr w:type="gramStart"/>
-      <w:r>
-        <w:rPr>
-          <w:lang w:val="en-US"/>
-        </w:rPr>
-        <w:t>was aimed</w:t>
-      </w:r>
-      <w:proofErr w:type="gramEnd"/>
-      <w:r>
-        <w:rPr>
-          <w:lang w:val="en-US"/>
-        </w:rPr>
-        <w:t xml:space="preserve"> at helping us get started with the project infrastructure. The main goal was to ensure that all group members could access the required systems, set up accounts, and successfully run a basic </w:t>
-      </w:r>
-      <w:proofErr w:type="spellStart"/>
-      <w:r>
-        <w:rPr>
-          <w:lang w:val="en-US"/>
-        </w:rPr>
-        <w:t>CloudLab</w:t>
-      </w:r>
-      <w:proofErr w:type="spellEnd"/>
-      <w:r>
-        <w:rPr>
-          <w:lang w:val="en-US"/>
-        </w:rPr>
-        <w:t xml:space="preserve"> experiment. The lab also helped us understand teamwork, version control, and remote server access.</w:t>
-      </w:r>
-    </w:p>
-    <w:p>
-      <w:pPr>
-        <w:rPr>
-          <w:lang w:val="en-US"/>
-        </w:rPr>
-      </w:pPr>
-    </w:p>
-    <w:p>
-      <w:pPr>
-        <w:rPr>
-          <w:b/>
-          <w:bCs/>
-          <w:lang w:val="en-US"/>
-        </w:rPr>
-      </w:pPr>
-      <w:r>
-        <w:rPr>
-          <w:b/>
-          <w:bCs/>
-          <w:lang w:val="en-US"/>
-        </w:rPr>
-        <w:t>Group Setup and Collaboration</w:t>
-      </w:r>
-    </w:p>
-    <w:p>
-      <w:pPr>
-        <w:rPr>
-          <w:lang w:val="en-US"/>
-        </w:rPr>
-      </w:pPr>
-      <w:r>
-        <w:rPr>
-          <w:lang w:val="en-US"/>
-        </w:rPr>
-        <w:t>First, I confirmed my group members using the provided group spreadsheet. We also verified our gro</w:t>
-      </w:r>
-      <w:r>
-        <w:rPr>
-          <w:lang w:val="en-US"/>
-        </w:rPr>
-        <w:t>up email (e.g., csc26-daz</w:t>
-      </w:r>
-      <w:r>
-        <w:rPr>
-          <w:lang w:val="en-US"/>
-        </w:rPr>
-        <w:t>@cit.ac.ug) by sending a test email, and all members received it successfully.</w:t>
-      </w:r>
-    </w:p>
-    <w:p>
-      <w:pPr>
-        <w:rPr>
-          <w:lang w:val="en-US"/>
-        </w:rPr>
-      </w:pPr>
-      <w:r>
-        <w:rPr>
-          <w:lang w:val="en-US"/>
-        </w:rPr>
-        <w:t>To improve collaboration, we created a private GitHub repository and added all group members as collaborators. This allows us to share code, notes, and project files easily throughout the semester.</w:t>
-      </w:r>
-    </w:p>
-    <w:p>
-      <w:pPr>
-        <w:rPr>
-          <w:lang w:val="en-US"/>
-        </w:rPr>
-      </w:pPr>
-    </w:p>
-    <w:p>
-      <w:pPr>
-        <w:rPr>
-          <w:b/>
-          <w:bCs/>
-          <w:lang w:val="en-US"/>
-        </w:rPr>
-      </w:pPr>
-      <w:proofErr w:type="spellStart"/>
-      <w:r>
-        <w:rPr>
-          <w:b/>
-          <w:bCs/>
-          <w:lang w:val="en-US"/>
-        </w:rPr>
-        <w:t>Cloud</w:t>
-      </w:r>
+      <w:r>
+        <w:rPr>
+          <w:rFonts w:ascii="Times New Roman" w:hAnsi="Times New Roman" w:cs="Times New Roman"/>
+          <w:sz w:val="28"/>
+          <w:szCs w:val="28"/>
+          <w:lang w:val="en-US"/>
+        </w:rPr>
+        <w:t>CLOUD COMPUTING</w:t>
+      </w:r>
+    </w:p>
+    <w:p>
+      <w:pPr>
+        <w:spacing w:line="360" w:lineRule="auto"/>
+        <w:jc w:val="center"/>
+        <w:rPr>
+          <w:rFonts w:ascii="Times New Roman" w:hAnsi="Times New Roman" w:cs="Times New Roman"/>
+          <w:sz w:val="28"/>
+          <w:szCs w:val="28"/>
+          <w:lang w:val="en-US"/>
+        </w:rPr>
+      </w:pPr>
+      <w:r>
+        <w:rPr>
+          <w:rFonts w:ascii="Times New Roman" w:hAnsi="Times New Roman" w:cs="Times New Roman"/>
+          <w:b/>
+          <w:bCs/>
+          <w:sz w:val="28"/>
+          <w:szCs w:val="28"/>
+        </w:rPr>
+        <w:t>ASSIGNMENT:</w:t>
+      </w:r>
+      <w:r>
+        <w:rPr>
+          <w:rFonts w:ascii="Times New Roman" w:hAnsi="Times New Roman" w:cs="Times New Roman"/>
+          <w:sz w:val="28"/>
+          <w:szCs w:val="28"/>
+        </w:rPr>
+        <w:t xml:space="preserve"> </w:t>
+      </w:r>
+      <w:r>
+        <w:rPr>
+          <w:rFonts w:ascii="Times New Roman" w:hAnsi="Times New Roman" w:cs="Times New Roman"/>
+          <w:sz w:val="28"/>
+          <w:szCs w:val="28"/>
+          <w:lang w:val="en-US"/>
+        </w:rPr>
+        <w:t>LAB 0</w:t>
+      </w:r>
+    </w:p>
+    <w:p>
+      <w:pPr>
+        <w:spacing w:line="360" w:lineRule="auto"/>
+        <w:jc w:val="center"/>
+        <w:rPr>
+          <w:rFonts w:ascii="Times New Roman" w:hAnsi="Times New Roman" w:cs="Times New Roman"/>
+          <w:b/>
+          <w:bCs/>
+          <w:sz w:val="28"/>
+          <w:szCs w:val="28"/>
+          <w:lang w:val="en-US"/>
+        </w:rPr>
+      </w:pPr>
+      <w:r>
+        <w:rPr>
+          <w:rFonts w:ascii="Times New Roman" w:hAnsi="Times New Roman" w:cs="Times New Roman"/>
+          <w:b/>
+          <w:bCs/>
+          <w:sz w:val="28"/>
+          <w:szCs w:val="28"/>
+        </w:rPr>
+        <w:t xml:space="preserve">GROUP: </w:t>
+      </w:r>
+      <w:r>
+        <w:rPr>
+          <w:rFonts w:ascii="Times New Roman" w:hAnsi="Times New Roman" w:cs="Times New Roman"/>
+          <w:b/>
+          <w:bCs/>
+          <w:sz w:val="28"/>
+          <w:szCs w:val="28"/>
+          <w:lang w:val="en-US"/>
+        </w:rPr>
+        <w:t>DAZ</w:t>
+      </w:r>
+    </w:p>
+    <w:p>
+      <w:pPr>
+        <w:spacing w:line="360" w:lineRule="auto"/>
+        <w:jc w:val="center"/>
+        <w:rPr>
+          <w:rFonts w:ascii="Times New Roman" w:hAnsi="Times New Roman" w:cs="Times New Roman"/>
+          <w:b/>
+          <w:bCs/>
+          <w:sz w:val="28"/>
+          <w:szCs w:val="28"/>
+          <w:lang w:val="en-US"/>
+        </w:rPr>
+      </w:pPr>
+    </w:p>
+    <w:tbl>
+      <w:tblPr>
+        <w:tblW w:w="8356" w:type="dxa"/>
+        <w:jc w:val="center"/>
+        <w:tblCellMar>
+          <w:left w:w="0" w:type="dxa"/>
+          <w:right w:w="0" w:type="dxa"/>
+        </w:tblCellMar>
+        <w:tblLook w:val="04A0" w:firstRow="1" w:lastRow="0" w:firstColumn="1" w:lastColumn="0" w:noHBand="0" w:noVBand="1"/>
+      </w:tblPr>
+      <w:tblGrid>
+        <w:gridCol w:w="568"/>
+        <w:gridCol w:w="417"/>
+        <w:gridCol w:w="2976"/>
+        <w:gridCol w:w="1701"/>
+        <w:gridCol w:w="2694"/>
+      </w:tblGrid>
+      <w:tr>
+        <w:trPr>
+          <w:trHeight w:val="315"/>
+          <w:jc w:val="center"/>
+        </w:trPr>
+        <w:tc>
+          <w:tcPr>
+            <w:tcW w:w="0" w:type="auto"/>
+            <w:vMerge w:val="restart"/>
+            <w:tcBorders>
+              <w:top w:val="single" w:sz="6" w:space="0" w:color="000000"/>
+              <w:left w:val="single" w:sz="6" w:space="0" w:color="000000"/>
+              <w:bottom w:val="single" w:sz="6" w:space="0" w:color="000000"/>
+              <w:right w:val="single" w:sz="6" w:space="0" w:color="000000"/>
+            </w:tcBorders>
+            <w:tcMar>
+              <w:top w:w="30" w:type="dxa"/>
+              <w:left w:w="45" w:type="dxa"/>
+              <w:bottom w:w="30" w:type="dxa"/>
+              <w:right w:w="45" w:type="dxa"/>
+            </w:tcMar>
+            <w:vAlign w:val="center"/>
+            <w:hideMark/>
+          </w:tcPr>
+          <w:p>
+            <w:pPr>
+              <w:spacing w:after="0" w:line="240" w:lineRule="auto"/>
+              <w:jc w:val="center"/>
+              <w:rPr>
+                <w:rFonts w:ascii="Roboto" w:eastAsia="Times New Roman" w:hAnsi="Roboto" w:cs="Arial"/>
+                <w:b/>
+                <w:bCs/>
+                <w:lang w:val="en-US"/>
+              </w:rPr>
+            </w:pPr>
+            <w:r>
+              <w:rPr>
+                <w:rFonts w:ascii="Roboto" w:eastAsia="Times New Roman" w:hAnsi="Roboto" w:cs="Arial"/>
+                <w:b/>
+                <w:bCs/>
+                <w:lang w:val="en-US"/>
+              </w:rPr>
+              <w:t>DAZ</w:t>
+            </w:r>
+          </w:p>
+        </w:tc>
+        <w:tc>
+          <w:tcPr>
+            <w:tcW w:w="417" w:type="dxa"/>
+            <w:tcBorders>
+              <w:top w:val="single" w:sz="6" w:space="0" w:color="000000"/>
+              <w:left w:val="single" w:sz="6" w:space="0" w:color="CCCCCC"/>
+              <w:bottom w:val="single" w:sz="6" w:space="0" w:color="000000"/>
+              <w:right w:val="single" w:sz="6" w:space="0" w:color="000000"/>
+            </w:tcBorders>
+            <w:tcMar>
+              <w:top w:w="30" w:type="dxa"/>
+              <w:left w:w="45" w:type="dxa"/>
+              <w:bottom w:w="30" w:type="dxa"/>
+              <w:right w:w="45" w:type="dxa"/>
+            </w:tcMar>
+            <w:vAlign w:val="bottom"/>
+            <w:hideMark/>
+          </w:tcPr>
+          <w:p>
+            <w:pPr>
+              <w:spacing w:after="0" w:line="240" w:lineRule="auto"/>
+              <w:jc w:val="right"/>
+              <w:rPr>
+                <w:rFonts w:ascii="Roboto" w:eastAsia="Times New Roman" w:hAnsi="Roboto" w:cs="Arial"/>
+                <w:lang w:val="en-US"/>
+              </w:rPr>
+            </w:pPr>
+            <w:r>
+              <w:rPr>
+                <w:rFonts w:ascii="Roboto" w:eastAsia="Times New Roman" w:hAnsi="Roboto" w:cs="Arial"/>
+                <w:lang w:val="en-US"/>
+              </w:rPr>
+              <w:t>1</w:t>
+            </w:r>
+          </w:p>
+        </w:tc>
+        <w:tc>
+          <w:tcPr>
+            <w:tcW w:w="2976" w:type="dxa"/>
+            <w:tcBorders>
+              <w:top w:val="single" w:sz="6" w:space="0" w:color="000000"/>
+              <w:left w:val="single" w:sz="6" w:space="0" w:color="CCCCCC"/>
+              <w:bottom w:val="single" w:sz="6" w:space="0" w:color="000000"/>
+              <w:right w:val="single" w:sz="6" w:space="0" w:color="000000"/>
+            </w:tcBorders>
+            <w:tcMar>
+              <w:top w:w="30" w:type="dxa"/>
+              <w:left w:w="45" w:type="dxa"/>
+              <w:bottom w:w="30" w:type="dxa"/>
+              <w:right w:w="45" w:type="dxa"/>
+            </w:tcMar>
+            <w:vAlign w:val="bottom"/>
+            <w:hideMark/>
+          </w:tcPr>
+          <w:p>
+            <w:pPr>
+              <w:spacing w:after="0" w:line="240" w:lineRule="auto"/>
+              <w:rPr>
+                <w:rFonts w:ascii="Roboto" w:eastAsia="Times New Roman" w:hAnsi="Roboto" w:cs="Arial"/>
+                <w:lang w:val="en-US"/>
+              </w:rPr>
+            </w:pPr>
+            <w:proofErr w:type="spellStart"/>
+            <w:r>
+              <w:rPr>
+                <w:rFonts w:ascii="Roboto" w:eastAsia="Times New Roman" w:hAnsi="Roboto" w:cs="Arial"/>
+                <w:lang w:val="en-US"/>
+              </w:rPr>
+              <w:t>Mwizerwa</w:t>
+            </w:r>
+            <w:proofErr w:type="spellEnd"/>
+            <w:r>
+              <w:rPr>
+                <w:rFonts w:ascii="Roboto" w:eastAsia="Times New Roman" w:hAnsi="Roboto" w:cs="Arial"/>
+                <w:lang w:val="en-US"/>
+              </w:rPr>
+              <w:t xml:space="preserve"> Timothy</w:t>
+            </w:r>
+          </w:p>
+        </w:tc>
+        <w:tc>
+          <w:tcPr>
+            <w:tcW w:w="1701" w:type="dxa"/>
+            <w:tcBorders>
+              <w:top w:val="single" w:sz="6" w:space="0" w:color="000000"/>
+              <w:left w:val="single" w:sz="6" w:space="0" w:color="CCCCCC"/>
+              <w:bottom w:val="single" w:sz="6" w:space="0" w:color="000000"/>
+              <w:right w:val="single" w:sz="6" w:space="0" w:color="000000"/>
+            </w:tcBorders>
+            <w:tcMar>
+              <w:top w:w="30" w:type="dxa"/>
+              <w:left w:w="45" w:type="dxa"/>
+              <w:bottom w:w="30" w:type="dxa"/>
+              <w:right w:w="45" w:type="dxa"/>
+            </w:tcMar>
+            <w:vAlign w:val="bottom"/>
+            <w:hideMark/>
+          </w:tcPr>
+          <w:p>
+            <w:pPr>
+              <w:spacing w:after="0" w:line="240" w:lineRule="auto"/>
+              <w:jc w:val="right"/>
+              <w:rPr>
+                <w:rFonts w:ascii="Roboto" w:eastAsia="Times New Roman" w:hAnsi="Roboto" w:cs="Arial"/>
+                <w:lang w:val="en-US"/>
+              </w:rPr>
+            </w:pPr>
+            <w:r>
+              <w:rPr>
+                <w:rFonts w:ascii="Roboto" w:eastAsia="Times New Roman" w:hAnsi="Roboto" w:cs="Arial"/>
+                <w:lang w:val="en-US"/>
+              </w:rPr>
+              <w:t>2400724330</w:t>
+            </w:r>
+          </w:p>
+        </w:tc>
+        <w:tc>
+          <w:tcPr>
+            <w:tcW w:w="2694" w:type="dxa"/>
+            <w:tcBorders>
+              <w:top w:val="single" w:sz="6" w:space="0" w:color="000000"/>
+              <w:left w:val="single" w:sz="6" w:space="0" w:color="CCCCCC"/>
+              <w:bottom w:val="single" w:sz="6" w:space="0" w:color="000000"/>
+              <w:right w:val="single" w:sz="6" w:space="0" w:color="000000"/>
+            </w:tcBorders>
+            <w:tcMar>
+              <w:top w:w="30" w:type="dxa"/>
+              <w:left w:w="45" w:type="dxa"/>
+              <w:bottom w:w="30" w:type="dxa"/>
+              <w:right w:w="45" w:type="dxa"/>
+            </w:tcMar>
+            <w:vAlign w:val="bottom"/>
+            <w:hideMark/>
+          </w:tcPr>
+          <w:p>
+            <w:pPr>
+              <w:spacing w:after="0" w:line="240" w:lineRule="auto"/>
+              <w:rPr>
+                <w:rFonts w:ascii="Roboto" w:eastAsia="Times New Roman" w:hAnsi="Roboto" w:cs="Arial"/>
+                <w:lang w:val="en-US"/>
+              </w:rPr>
+            </w:pPr>
+            <w:r>
+              <w:rPr>
+                <w:rFonts w:ascii="Roboto" w:eastAsia="Times New Roman" w:hAnsi="Roboto" w:cs="Arial"/>
+                <w:lang w:val="en-US"/>
+              </w:rPr>
+              <w:t>24/U/24330/PS</w:t>
+            </w:r>
+          </w:p>
+        </w:tc>
+      </w:tr>
+      <w:tr>
+        <w:trPr>
+          <w:trHeight w:val="315"/>
+          <w:jc w:val="center"/>
+        </w:trPr>
+        <w:tc>
+          <w:tcPr>
+            <w:tcW w:w="0" w:type="auto"/>
+            <w:vMerge/>
+            <w:tcBorders>
+              <w:top w:val="single" w:sz="6" w:space="0" w:color="000000"/>
+              <w:left w:val="single" w:sz="6" w:space="0" w:color="000000"/>
+              <w:bottom w:val="single" w:sz="6" w:space="0" w:color="000000"/>
+              <w:right w:val="single" w:sz="6" w:space="0" w:color="000000"/>
+            </w:tcBorders>
+            <w:vAlign w:val="center"/>
+            <w:hideMark/>
+          </w:tcPr>
+          <w:p>
+            <w:pPr>
+              <w:spacing w:after="0" w:line="240" w:lineRule="auto"/>
+              <w:rPr>
+                <w:rFonts w:ascii="Roboto" w:eastAsia="Times New Roman" w:hAnsi="Roboto" w:cs="Arial"/>
+                <w:b/>
+                <w:bCs/>
+                <w:lang w:val="en-US"/>
+              </w:rPr>
+            </w:pPr>
+          </w:p>
+        </w:tc>
+        <w:tc>
+          <w:tcPr>
+            <w:tcW w:w="417" w:type="dxa"/>
+            <w:tcBorders>
+              <w:top w:val="single" w:sz="6" w:space="0" w:color="CCCCCC"/>
+              <w:left w:val="single" w:sz="6" w:space="0" w:color="CCCCCC"/>
+              <w:bottom w:val="single" w:sz="6" w:space="0" w:color="000000"/>
+              <w:right w:val="single" w:sz="6" w:space="0" w:color="000000"/>
+            </w:tcBorders>
+            <w:tcMar>
+              <w:top w:w="30" w:type="dxa"/>
+              <w:left w:w="45" w:type="dxa"/>
+              <w:bottom w:w="30" w:type="dxa"/>
+              <w:right w:w="45" w:type="dxa"/>
+            </w:tcMar>
+            <w:vAlign w:val="bottom"/>
+            <w:hideMark/>
+          </w:tcPr>
+          <w:p>
+            <w:pPr>
+              <w:spacing w:after="0" w:line="240" w:lineRule="auto"/>
+              <w:jc w:val="right"/>
+              <w:rPr>
+                <w:rFonts w:ascii="Roboto" w:eastAsia="Times New Roman" w:hAnsi="Roboto" w:cs="Arial"/>
+                <w:lang w:val="en-US"/>
+              </w:rPr>
+            </w:pPr>
+            <w:r>
+              <w:rPr>
+                <w:rFonts w:ascii="Roboto" w:eastAsia="Times New Roman" w:hAnsi="Roboto" w:cs="Arial"/>
+                <w:lang w:val="en-US"/>
+              </w:rPr>
+              <w:t>2</w:t>
+            </w:r>
+          </w:p>
+        </w:tc>
+        <w:tc>
+          <w:tcPr>
+            <w:tcW w:w="2976" w:type="dxa"/>
+            <w:tcBorders>
+              <w:top w:val="single" w:sz="6" w:space="0" w:color="CCCCCC"/>
+              <w:left w:val="single" w:sz="6" w:space="0" w:color="CCCCCC"/>
+              <w:bottom w:val="single" w:sz="6" w:space="0" w:color="000000"/>
+              <w:right w:val="single" w:sz="6" w:space="0" w:color="000000"/>
+            </w:tcBorders>
+            <w:tcMar>
+              <w:top w:w="30" w:type="dxa"/>
+              <w:left w:w="45" w:type="dxa"/>
+              <w:bottom w:w="30" w:type="dxa"/>
+              <w:right w:w="45" w:type="dxa"/>
+            </w:tcMar>
+            <w:vAlign w:val="bottom"/>
+            <w:hideMark/>
+          </w:tcPr>
+          <w:p>
+            <w:pPr>
+              <w:spacing w:after="0" w:line="240" w:lineRule="auto"/>
+              <w:rPr>
+                <w:rFonts w:ascii="Roboto" w:eastAsia="Times New Roman" w:hAnsi="Roboto" w:cs="Arial"/>
+                <w:lang w:val="en-US"/>
+              </w:rPr>
+            </w:pPr>
+            <w:proofErr w:type="spellStart"/>
+            <w:r>
+              <w:rPr>
+                <w:rFonts w:ascii="Roboto" w:eastAsia="Times New Roman" w:hAnsi="Roboto" w:cs="Arial"/>
+                <w:lang w:val="en-US"/>
+              </w:rPr>
+              <w:t>Kinda</w:t>
+            </w:r>
+            <w:proofErr w:type="spellEnd"/>
+            <w:r>
+              <w:rPr>
+                <w:rFonts w:ascii="Roboto" w:eastAsia="Times New Roman" w:hAnsi="Roboto" w:cs="Arial"/>
+                <w:lang w:val="en-US"/>
+              </w:rPr>
+              <w:t xml:space="preserve"> Kelsey </w:t>
+            </w:r>
+            <w:proofErr w:type="spellStart"/>
+            <w:r>
+              <w:rPr>
+                <w:rFonts w:ascii="Roboto" w:eastAsia="Times New Roman" w:hAnsi="Roboto" w:cs="Arial"/>
+                <w:lang w:val="en-US"/>
+              </w:rPr>
+              <w:t>Naluwafu</w:t>
+            </w:r>
+            <w:proofErr w:type="spellEnd"/>
+          </w:p>
+        </w:tc>
+        <w:tc>
+          <w:tcPr>
+            <w:tcW w:w="1701" w:type="dxa"/>
+            <w:tcBorders>
+              <w:top w:val="single" w:sz="6" w:space="0" w:color="CCCCCC"/>
+              <w:left w:val="single" w:sz="6" w:space="0" w:color="CCCCCC"/>
+              <w:bottom w:val="single" w:sz="6" w:space="0" w:color="000000"/>
+              <w:right w:val="single" w:sz="6" w:space="0" w:color="000000"/>
+            </w:tcBorders>
+            <w:tcMar>
+              <w:top w:w="30" w:type="dxa"/>
+              <w:left w:w="45" w:type="dxa"/>
+              <w:bottom w:w="30" w:type="dxa"/>
+              <w:right w:w="45" w:type="dxa"/>
+            </w:tcMar>
+            <w:vAlign w:val="bottom"/>
+            <w:hideMark/>
+          </w:tcPr>
+          <w:p>
+            <w:pPr>
+              <w:spacing w:after="0" w:line="240" w:lineRule="auto"/>
+              <w:jc w:val="right"/>
+              <w:rPr>
+                <w:rFonts w:ascii="Roboto" w:eastAsia="Times New Roman" w:hAnsi="Roboto" w:cs="Arial"/>
+                <w:lang w:val="en-US"/>
+              </w:rPr>
+            </w:pPr>
+            <w:r>
+              <w:rPr>
+                <w:rFonts w:ascii="Roboto" w:eastAsia="Times New Roman" w:hAnsi="Roboto" w:cs="Arial"/>
+                <w:lang w:val="en-US"/>
+              </w:rPr>
+              <w:t>2400705862</w:t>
+            </w:r>
+          </w:p>
+        </w:tc>
+        <w:tc>
+          <w:tcPr>
+            <w:tcW w:w="2694" w:type="dxa"/>
+            <w:tcBorders>
+              <w:top w:val="single" w:sz="6" w:space="0" w:color="CCCCCC"/>
+              <w:left w:val="single" w:sz="6" w:space="0" w:color="CCCCCC"/>
+              <w:bottom w:val="single" w:sz="6" w:space="0" w:color="000000"/>
+              <w:right w:val="single" w:sz="6" w:space="0" w:color="000000"/>
+            </w:tcBorders>
+            <w:tcMar>
+              <w:top w:w="30" w:type="dxa"/>
+              <w:left w:w="45" w:type="dxa"/>
+              <w:bottom w:w="30" w:type="dxa"/>
+              <w:right w:w="45" w:type="dxa"/>
+            </w:tcMar>
+            <w:vAlign w:val="bottom"/>
+            <w:hideMark/>
+          </w:tcPr>
+          <w:p>
+            <w:pPr>
+              <w:spacing w:after="0" w:line="240" w:lineRule="auto"/>
+              <w:rPr>
+                <w:rFonts w:ascii="Roboto" w:eastAsia="Times New Roman" w:hAnsi="Roboto" w:cs="Arial"/>
+                <w:lang w:val="en-US"/>
+              </w:rPr>
+            </w:pPr>
+            <w:r>
+              <w:rPr>
+                <w:rFonts w:ascii="Roboto" w:eastAsia="Times New Roman" w:hAnsi="Roboto" w:cs="Arial"/>
+                <w:lang w:val="en-US"/>
+              </w:rPr>
+              <w:t>24/U/05862/PS</w:t>
+            </w:r>
+          </w:p>
+        </w:tc>
+      </w:tr>
+      <w:tr>
+        <w:trPr>
+          <w:trHeight w:val="315"/>
+          <w:jc w:val="center"/>
+        </w:trPr>
+        <w:tc>
+          <w:tcPr>
+            <w:tcW w:w="0" w:type="auto"/>
+            <w:vMerge/>
+            <w:tcBorders>
+              <w:top w:val="single" w:sz="6" w:space="0" w:color="000000"/>
+              <w:left w:val="single" w:sz="6" w:space="0" w:color="000000"/>
+              <w:bottom w:val="single" w:sz="6" w:space="0" w:color="000000"/>
+              <w:right w:val="single" w:sz="6" w:space="0" w:color="000000"/>
+            </w:tcBorders>
+            <w:vAlign w:val="center"/>
+            <w:hideMark/>
+          </w:tcPr>
+          <w:p>
+            <w:pPr>
+              <w:spacing w:after="0" w:line="240" w:lineRule="auto"/>
+              <w:rPr>
+                <w:rFonts w:ascii="Roboto" w:eastAsia="Times New Roman" w:hAnsi="Roboto" w:cs="Arial"/>
+                <w:b/>
+                <w:bCs/>
+                <w:lang w:val="en-US"/>
+              </w:rPr>
+            </w:pPr>
+          </w:p>
+        </w:tc>
+        <w:tc>
+          <w:tcPr>
+            <w:tcW w:w="417" w:type="dxa"/>
+            <w:tcBorders>
+              <w:top w:val="single" w:sz="6" w:space="0" w:color="CCCCCC"/>
+              <w:left w:val="single" w:sz="6" w:space="0" w:color="CCCCCC"/>
+              <w:bottom w:val="single" w:sz="6" w:space="0" w:color="000000"/>
+              <w:right w:val="single" w:sz="6" w:space="0" w:color="000000"/>
+            </w:tcBorders>
+            <w:tcMar>
+              <w:top w:w="30" w:type="dxa"/>
+              <w:left w:w="45" w:type="dxa"/>
+              <w:bottom w:w="30" w:type="dxa"/>
+              <w:right w:w="45" w:type="dxa"/>
+            </w:tcMar>
+            <w:vAlign w:val="bottom"/>
+            <w:hideMark/>
+          </w:tcPr>
+          <w:p>
+            <w:pPr>
+              <w:spacing w:after="0" w:line="240" w:lineRule="auto"/>
+              <w:jc w:val="right"/>
+              <w:rPr>
+                <w:rFonts w:ascii="Roboto" w:eastAsia="Times New Roman" w:hAnsi="Roboto" w:cs="Arial"/>
+                <w:lang w:val="en-US"/>
+              </w:rPr>
+            </w:pPr>
+            <w:r>
+              <w:rPr>
+                <w:rFonts w:ascii="Roboto" w:eastAsia="Times New Roman" w:hAnsi="Roboto" w:cs="Arial"/>
+                <w:lang w:val="en-US"/>
+              </w:rPr>
+              <w:t>3</w:t>
+            </w:r>
+          </w:p>
+        </w:tc>
+        <w:tc>
+          <w:tcPr>
+            <w:tcW w:w="2976" w:type="dxa"/>
+            <w:tcBorders>
+              <w:top w:val="single" w:sz="6" w:space="0" w:color="CCCCCC"/>
+              <w:left w:val="single" w:sz="6" w:space="0" w:color="CCCCCC"/>
+              <w:bottom w:val="single" w:sz="6" w:space="0" w:color="CCCCCC"/>
+              <w:right w:val="single" w:sz="6" w:space="0" w:color="000000"/>
+            </w:tcBorders>
+            <w:tcMar>
+              <w:top w:w="30" w:type="dxa"/>
+              <w:left w:w="45" w:type="dxa"/>
+              <w:bottom w:w="30" w:type="dxa"/>
+              <w:right w:w="45" w:type="dxa"/>
+            </w:tcMar>
+            <w:vAlign w:val="bottom"/>
+            <w:hideMark/>
+          </w:tcPr>
+          <w:p>
+            <w:pPr>
+              <w:spacing w:after="0" w:line="240" w:lineRule="auto"/>
+              <w:rPr>
+                <w:rFonts w:ascii="Roboto" w:eastAsia="Times New Roman" w:hAnsi="Roboto" w:cs="Arial"/>
+                <w:lang w:val="en-US"/>
+              </w:rPr>
+            </w:pPr>
+            <w:r>
+              <w:rPr>
+                <w:rFonts w:ascii="Roboto" w:eastAsia="Times New Roman" w:hAnsi="Roboto" w:cs="Arial"/>
+                <w:lang w:val="en-US"/>
+              </w:rPr>
+              <w:t xml:space="preserve">Kato Adrian </w:t>
+            </w:r>
+            <w:proofErr w:type="spellStart"/>
+            <w:r>
+              <w:rPr>
+                <w:rFonts w:ascii="Roboto" w:eastAsia="Times New Roman" w:hAnsi="Roboto" w:cs="Arial"/>
+                <w:lang w:val="en-US"/>
+              </w:rPr>
+              <w:t>Mugerwa</w:t>
+            </w:r>
+            <w:proofErr w:type="spellEnd"/>
+          </w:p>
+        </w:tc>
+        <w:tc>
+          <w:tcPr>
+            <w:tcW w:w="1701" w:type="dxa"/>
+            <w:tcBorders>
+              <w:top w:val="single" w:sz="6" w:space="0" w:color="CCCCCC"/>
+              <w:left w:val="single" w:sz="6" w:space="0" w:color="CCCCCC"/>
+              <w:bottom w:val="single" w:sz="6" w:space="0" w:color="000000"/>
+              <w:right w:val="single" w:sz="6" w:space="0" w:color="000000"/>
+            </w:tcBorders>
+            <w:tcMar>
+              <w:top w:w="30" w:type="dxa"/>
+              <w:left w:w="45" w:type="dxa"/>
+              <w:bottom w:w="30" w:type="dxa"/>
+              <w:right w:w="45" w:type="dxa"/>
+            </w:tcMar>
+            <w:vAlign w:val="bottom"/>
+            <w:hideMark/>
+          </w:tcPr>
+          <w:p>
+            <w:pPr>
+              <w:spacing w:after="0" w:line="240" w:lineRule="auto"/>
+              <w:jc w:val="right"/>
+              <w:rPr>
+                <w:rFonts w:ascii="Roboto" w:eastAsia="Times New Roman" w:hAnsi="Roboto" w:cs="Arial"/>
+                <w:lang w:val="en-US"/>
+              </w:rPr>
+            </w:pPr>
+            <w:r>
+              <w:rPr>
+                <w:rFonts w:ascii="Roboto" w:eastAsia="Times New Roman" w:hAnsi="Roboto" w:cs="Arial"/>
+                <w:lang w:val="en-US"/>
+              </w:rPr>
+              <w:t>2400725909</w:t>
+            </w:r>
+          </w:p>
+        </w:tc>
+        <w:tc>
+          <w:tcPr>
+            <w:tcW w:w="2694" w:type="dxa"/>
+            <w:tcBorders>
+              <w:top w:val="single" w:sz="6" w:space="0" w:color="CCCCCC"/>
+              <w:left w:val="single" w:sz="6" w:space="0" w:color="CCCCCC"/>
+              <w:bottom w:val="single" w:sz="6" w:space="0" w:color="000000"/>
+              <w:right w:val="single" w:sz="6" w:space="0" w:color="000000"/>
+            </w:tcBorders>
+            <w:tcMar>
+              <w:top w:w="30" w:type="dxa"/>
+              <w:left w:w="45" w:type="dxa"/>
+              <w:bottom w:w="30" w:type="dxa"/>
+              <w:right w:w="45" w:type="dxa"/>
+            </w:tcMar>
+            <w:vAlign w:val="bottom"/>
+            <w:hideMark/>
+          </w:tcPr>
+          <w:p>
+            <w:pPr>
+              <w:spacing w:after="0" w:line="240" w:lineRule="auto"/>
+              <w:rPr>
+                <w:rFonts w:ascii="Roboto" w:eastAsia="Times New Roman" w:hAnsi="Roboto" w:cs="Arial"/>
+                <w:lang w:val="en-US"/>
+              </w:rPr>
+            </w:pPr>
+            <w:r>
+              <w:rPr>
+                <w:rFonts w:ascii="Roboto" w:eastAsia="Times New Roman" w:hAnsi="Roboto" w:cs="Arial"/>
+                <w:lang w:val="en-US"/>
+              </w:rPr>
+              <w:t>24/U/25909/PS</w:t>
+            </w:r>
+          </w:p>
+        </w:tc>
+      </w:tr>
+      <w:tr>
+        <w:trPr>
+          <w:trHeight w:val="315"/>
+          <w:jc w:val="center"/>
+        </w:trPr>
+        <w:tc>
+          <w:tcPr>
+            <w:tcW w:w="0" w:type="auto"/>
+            <w:vMerge/>
+            <w:tcBorders>
+              <w:top w:val="single" w:sz="6" w:space="0" w:color="000000"/>
+              <w:left w:val="single" w:sz="6" w:space="0" w:color="000000"/>
+              <w:bottom w:val="single" w:sz="6" w:space="0" w:color="000000"/>
+              <w:right w:val="single" w:sz="6" w:space="0" w:color="000000"/>
+            </w:tcBorders>
+            <w:vAlign w:val="center"/>
+            <w:hideMark/>
+          </w:tcPr>
+          <w:p>
+            <w:pPr>
+              <w:spacing w:after="0" w:line="240" w:lineRule="auto"/>
+              <w:rPr>
+                <w:rFonts w:ascii="Roboto" w:eastAsia="Times New Roman" w:hAnsi="Roboto" w:cs="Arial"/>
+                <w:b/>
+                <w:bCs/>
+                <w:lang w:val="en-US"/>
+              </w:rPr>
+            </w:pPr>
+          </w:p>
+        </w:tc>
+        <w:tc>
+          <w:tcPr>
+            <w:tcW w:w="417" w:type="dxa"/>
+            <w:tcBorders>
+              <w:top w:val="single" w:sz="6" w:space="0" w:color="CCCCCC"/>
+              <w:left w:val="single" w:sz="6" w:space="0" w:color="CCCCCC"/>
+              <w:bottom w:val="single" w:sz="6" w:space="0" w:color="000000"/>
+              <w:right w:val="single" w:sz="6" w:space="0" w:color="000000"/>
+            </w:tcBorders>
+            <w:tcMar>
+              <w:top w:w="30" w:type="dxa"/>
+              <w:left w:w="45" w:type="dxa"/>
+              <w:bottom w:w="30" w:type="dxa"/>
+              <w:right w:w="45" w:type="dxa"/>
+            </w:tcMar>
+            <w:vAlign w:val="bottom"/>
+            <w:hideMark/>
+          </w:tcPr>
+          <w:p>
+            <w:pPr>
+              <w:spacing w:after="0" w:line="240" w:lineRule="auto"/>
+              <w:jc w:val="right"/>
+              <w:rPr>
+                <w:rFonts w:ascii="Roboto" w:eastAsia="Times New Roman" w:hAnsi="Roboto" w:cs="Arial"/>
+                <w:lang w:val="en-US"/>
+              </w:rPr>
+            </w:pPr>
+            <w:r>
+              <w:rPr>
+                <w:rFonts w:ascii="Roboto" w:eastAsia="Times New Roman" w:hAnsi="Roboto" w:cs="Arial"/>
+                <w:lang w:val="en-US"/>
+              </w:rPr>
+              <w:t>4</w:t>
+            </w:r>
+          </w:p>
+        </w:tc>
+        <w:tc>
+          <w:tcPr>
+            <w:tcW w:w="2976" w:type="dxa"/>
+            <w:tcBorders>
+              <w:top w:val="single" w:sz="6" w:space="0" w:color="CCCCCC"/>
+              <w:left w:val="single" w:sz="6" w:space="0" w:color="CCCCCC"/>
+              <w:bottom w:val="single" w:sz="6" w:space="0" w:color="000000"/>
+              <w:right w:val="single" w:sz="6" w:space="0" w:color="000000"/>
+            </w:tcBorders>
+            <w:tcMar>
+              <w:top w:w="30" w:type="dxa"/>
+              <w:left w:w="45" w:type="dxa"/>
+              <w:bottom w:w="30" w:type="dxa"/>
+              <w:right w:w="45" w:type="dxa"/>
+            </w:tcMar>
+            <w:vAlign w:val="bottom"/>
+            <w:hideMark/>
+          </w:tcPr>
+          <w:p>
+            <w:pPr>
+              <w:spacing w:after="0" w:line="240" w:lineRule="auto"/>
+              <w:rPr>
+                <w:rFonts w:ascii="Roboto" w:eastAsia="Times New Roman" w:hAnsi="Roboto" w:cs="Arial"/>
+                <w:lang w:val="en-US"/>
+              </w:rPr>
+            </w:pPr>
+            <w:proofErr w:type="spellStart"/>
+            <w:r>
+              <w:rPr>
+                <w:rFonts w:ascii="Roboto" w:eastAsia="Times New Roman" w:hAnsi="Roboto" w:cs="Arial"/>
+                <w:lang w:val="en-US"/>
+              </w:rPr>
+              <w:t>Naluyima</w:t>
+            </w:r>
+            <w:proofErr w:type="spellEnd"/>
+            <w:r>
+              <w:rPr>
+                <w:rFonts w:ascii="Roboto" w:eastAsia="Times New Roman" w:hAnsi="Roboto" w:cs="Arial"/>
+                <w:lang w:val="en-US"/>
+              </w:rPr>
+              <w:t xml:space="preserve"> Pauline Oliver</w:t>
+            </w:r>
+          </w:p>
+        </w:tc>
+        <w:tc>
+          <w:tcPr>
+            <w:tcW w:w="1701" w:type="dxa"/>
+            <w:tcBorders>
+              <w:top w:val="single" w:sz="6" w:space="0" w:color="CCCCCC"/>
+              <w:left w:val="single" w:sz="6" w:space="0" w:color="CCCCCC"/>
+              <w:bottom w:val="single" w:sz="6" w:space="0" w:color="000000"/>
+              <w:right w:val="single" w:sz="6" w:space="0" w:color="000000"/>
+            </w:tcBorders>
+            <w:tcMar>
+              <w:top w:w="30" w:type="dxa"/>
+              <w:left w:w="45" w:type="dxa"/>
+              <w:bottom w:w="30" w:type="dxa"/>
+              <w:right w:w="45" w:type="dxa"/>
+            </w:tcMar>
+            <w:vAlign w:val="bottom"/>
+            <w:hideMark/>
+          </w:tcPr>
+          <w:p>
+            <w:pPr>
+              <w:spacing w:after="0" w:line="240" w:lineRule="auto"/>
+              <w:jc w:val="right"/>
+              <w:rPr>
+                <w:rFonts w:ascii="Roboto" w:eastAsia="Times New Roman" w:hAnsi="Roboto" w:cs="Arial"/>
+                <w:lang w:val="en-US"/>
+              </w:rPr>
+            </w:pPr>
+            <w:r>
+              <w:rPr>
+                <w:rFonts w:ascii="Roboto" w:eastAsia="Times New Roman" w:hAnsi="Roboto" w:cs="Arial"/>
+                <w:lang w:val="en-US"/>
+              </w:rPr>
+              <w:t>2400708847</w:t>
+            </w:r>
+          </w:p>
+        </w:tc>
+        <w:tc>
+          <w:tcPr>
+            <w:tcW w:w="2694" w:type="dxa"/>
+            <w:tcBorders>
+              <w:top w:val="single" w:sz="6" w:space="0" w:color="CCCCCC"/>
+              <w:left w:val="single" w:sz="6" w:space="0" w:color="CCCCCC"/>
+              <w:bottom w:val="single" w:sz="6" w:space="0" w:color="000000"/>
+              <w:right w:val="single" w:sz="6" w:space="0" w:color="000000"/>
+            </w:tcBorders>
+            <w:tcMar>
+              <w:top w:w="30" w:type="dxa"/>
+              <w:left w:w="45" w:type="dxa"/>
+              <w:bottom w:w="30" w:type="dxa"/>
+              <w:right w:w="45" w:type="dxa"/>
+            </w:tcMar>
+            <w:vAlign w:val="bottom"/>
+            <w:hideMark/>
+          </w:tcPr>
+          <w:p>
+            <w:pPr>
+              <w:spacing w:after="0" w:line="240" w:lineRule="auto"/>
+              <w:rPr>
+                <w:rFonts w:ascii="Roboto" w:eastAsia="Times New Roman" w:hAnsi="Roboto" w:cs="Arial"/>
+                <w:lang w:val="en-US"/>
+              </w:rPr>
+            </w:pPr>
+            <w:r>
+              <w:rPr>
+                <w:rFonts w:ascii="Roboto" w:eastAsia="Times New Roman" w:hAnsi="Roboto" w:cs="Arial"/>
+                <w:lang w:val="en-US"/>
+              </w:rPr>
+              <w:t>24/U/08847/PS</w:t>
+            </w:r>
+          </w:p>
+        </w:tc>
+      </w:tr>
+      <w:tr>
+        <w:trPr>
+          <w:trHeight w:val="315"/>
+          <w:jc w:val="center"/>
+        </w:trPr>
+        <w:tc>
+          <w:tcPr>
+            <w:tcW w:w="0" w:type="auto"/>
+            <w:vMerge/>
+            <w:tcBorders>
+              <w:top w:val="single" w:sz="6" w:space="0" w:color="000000"/>
+              <w:left w:val="single" w:sz="6" w:space="0" w:color="000000"/>
+              <w:bottom w:val="single" w:sz="6" w:space="0" w:color="000000"/>
+              <w:right w:val="single" w:sz="6" w:space="0" w:color="000000"/>
+            </w:tcBorders>
+            <w:vAlign w:val="center"/>
+            <w:hideMark/>
+          </w:tcPr>
+          <w:p>
+            <w:pPr>
+              <w:spacing w:after="0" w:line="240" w:lineRule="auto"/>
+              <w:rPr>
+                <w:rFonts w:ascii="Roboto" w:eastAsia="Times New Roman" w:hAnsi="Roboto" w:cs="Arial"/>
+                <w:b/>
+                <w:bCs/>
+                <w:lang w:val="en-US"/>
+              </w:rPr>
+            </w:pPr>
+          </w:p>
+        </w:tc>
+        <w:tc>
+          <w:tcPr>
+            <w:tcW w:w="417" w:type="dxa"/>
+            <w:tcBorders>
+              <w:top w:val="single" w:sz="6" w:space="0" w:color="CCCCCC"/>
+              <w:left w:val="single" w:sz="6" w:space="0" w:color="CCCCCC"/>
+              <w:bottom w:val="single" w:sz="6" w:space="0" w:color="000000"/>
+              <w:right w:val="single" w:sz="6" w:space="0" w:color="000000"/>
+            </w:tcBorders>
+            <w:tcMar>
+              <w:top w:w="30" w:type="dxa"/>
+              <w:left w:w="45" w:type="dxa"/>
+              <w:bottom w:w="30" w:type="dxa"/>
+              <w:right w:w="45" w:type="dxa"/>
+            </w:tcMar>
+            <w:vAlign w:val="bottom"/>
+            <w:hideMark/>
+          </w:tcPr>
+          <w:p>
+            <w:pPr>
+              <w:spacing w:after="0" w:line="240" w:lineRule="auto"/>
+              <w:jc w:val="right"/>
+              <w:rPr>
+                <w:rFonts w:ascii="Roboto" w:eastAsia="Times New Roman" w:hAnsi="Roboto" w:cs="Arial"/>
+                <w:lang w:val="en-US"/>
+              </w:rPr>
+            </w:pPr>
+            <w:r>
+              <w:rPr>
+                <w:rFonts w:ascii="Roboto" w:eastAsia="Times New Roman" w:hAnsi="Roboto" w:cs="Arial"/>
+                <w:lang w:val="en-US"/>
+              </w:rPr>
+              <w:t>5</w:t>
+            </w:r>
+          </w:p>
+        </w:tc>
+        <w:tc>
+          <w:tcPr>
+            <w:tcW w:w="2976" w:type="dxa"/>
+            <w:tcBorders>
+              <w:top w:val="single" w:sz="6" w:space="0" w:color="CCCCCC"/>
+              <w:left w:val="single" w:sz="6" w:space="0" w:color="CCCCCC"/>
+              <w:bottom w:val="single" w:sz="6" w:space="0" w:color="000000"/>
+              <w:right w:val="single" w:sz="6" w:space="0" w:color="000000"/>
+            </w:tcBorders>
+            <w:tcMar>
+              <w:top w:w="30" w:type="dxa"/>
+              <w:left w:w="45" w:type="dxa"/>
+              <w:bottom w:w="30" w:type="dxa"/>
+              <w:right w:w="45" w:type="dxa"/>
+            </w:tcMar>
+            <w:vAlign w:val="bottom"/>
+            <w:hideMark/>
+          </w:tcPr>
+          <w:p>
+            <w:pPr>
+              <w:spacing w:after="0" w:line="240" w:lineRule="auto"/>
+              <w:rPr>
+                <w:rFonts w:ascii="Roboto" w:eastAsia="Times New Roman" w:hAnsi="Roboto" w:cs="Arial"/>
+                <w:lang w:val="en-US"/>
+              </w:rPr>
+            </w:pPr>
+            <w:proofErr w:type="spellStart"/>
+            <w:r>
+              <w:rPr>
+                <w:rFonts w:ascii="Roboto" w:eastAsia="Times New Roman" w:hAnsi="Roboto" w:cs="Arial"/>
+                <w:lang w:val="en-US"/>
+              </w:rPr>
+              <w:t>Aroba</w:t>
+            </w:r>
+            <w:proofErr w:type="spellEnd"/>
+            <w:r>
+              <w:rPr>
+                <w:rFonts w:ascii="Roboto" w:eastAsia="Times New Roman" w:hAnsi="Roboto" w:cs="Arial"/>
+                <w:lang w:val="en-US"/>
+              </w:rPr>
+              <w:t xml:space="preserve"> Joseph</w:t>
+            </w:r>
+          </w:p>
+        </w:tc>
+        <w:tc>
+          <w:tcPr>
+            <w:tcW w:w="1701" w:type="dxa"/>
+            <w:tcBorders>
+              <w:top w:val="single" w:sz="6" w:space="0" w:color="CCCCCC"/>
+              <w:left w:val="single" w:sz="6" w:space="0" w:color="CCCCCC"/>
+              <w:bottom w:val="single" w:sz="6" w:space="0" w:color="000000"/>
+              <w:right w:val="single" w:sz="6" w:space="0" w:color="000000"/>
+            </w:tcBorders>
+            <w:tcMar>
+              <w:top w:w="30" w:type="dxa"/>
+              <w:left w:w="45" w:type="dxa"/>
+              <w:bottom w:w="30" w:type="dxa"/>
+              <w:right w:w="45" w:type="dxa"/>
+            </w:tcMar>
+            <w:vAlign w:val="bottom"/>
+            <w:hideMark/>
+          </w:tcPr>
+          <w:p>
+            <w:pPr>
+              <w:spacing w:after="0" w:line="240" w:lineRule="auto"/>
+              <w:jc w:val="right"/>
+              <w:rPr>
+                <w:rFonts w:ascii="Roboto" w:eastAsia="Times New Roman" w:hAnsi="Roboto" w:cs="Arial"/>
+                <w:lang w:val="en-US"/>
+              </w:rPr>
+            </w:pPr>
+            <w:r>
+              <w:rPr>
+                <w:rFonts w:ascii="Roboto" w:eastAsia="Times New Roman" w:hAnsi="Roboto" w:cs="Arial"/>
+                <w:lang w:val="en-US"/>
+              </w:rPr>
+              <w:t>2400703646</w:t>
+            </w:r>
+          </w:p>
+        </w:tc>
+        <w:tc>
+          <w:tcPr>
+            <w:tcW w:w="2694" w:type="dxa"/>
+            <w:tcBorders>
+              <w:top w:val="single" w:sz="6" w:space="0" w:color="CCCCCC"/>
+              <w:left w:val="single" w:sz="6" w:space="0" w:color="CCCCCC"/>
+              <w:bottom w:val="single" w:sz="6" w:space="0" w:color="000000"/>
+              <w:right w:val="single" w:sz="6" w:space="0" w:color="000000"/>
+            </w:tcBorders>
+            <w:tcMar>
+              <w:top w:w="30" w:type="dxa"/>
+              <w:left w:w="45" w:type="dxa"/>
+              <w:bottom w:w="30" w:type="dxa"/>
+              <w:right w:w="45" w:type="dxa"/>
+            </w:tcMar>
+            <w:vAlign w:val="bottom"/>
+            <w:hideMark/>
+          </w:tcPr>
+          <w:p>
+            <w:pPr>
+              <w:spacing w:after="0" w:line="240" w:lineRule="auto"/>
+              <w:rPr>
+                <w:rFonts w:ascii="Roboto" w:eastAsia="Times New Roman" w:hAnsi="Roboto" w:cs="Arial"/>
+                <w:lang w:val="en-US"/>
+              </w:rPr>
+            </w:pPr>
+            <w:r>
+              <w:rPr>
+                <w:rFonts w:ascii="Roboto" w:eastAsia="Times New Roman" w:hAnsi="Roboto" w:cs="Arial"/>
+                <w:lang w:val="en-US"/>
+              </w:rPr>
+              <w:t>24/U/03646/EVE</w:t>
+            </w:r>
+          </w:p>
+        </w:tc>
+      </w:tr>
+    </w:tbl>
+    <w:p>
+      <w:pPr>
+        <w:spacing w:line="360" w:lineRule="auto"/>
+        <w:rPr>
+          <w:rFonts w:ascii="Times New Roman" w:hAnsi="Times New Roman" w:cs="Times New Roman"/>
+          <w:b/>
+          <w:bCs/>
+          <w:lang w:val="en-US"/>
+        </w:rPr>
+      </w:pPr>
+    </w:p>
+    <w:p>
+      <w:pPr>
+        <w:jc w:val="center"/>
+        <w:rPr>
+          <w:lang w:val="en-US"/>
+        </w:rPr>
+      </w:pPr>
+    </w:p>
+    <w:p>
+      <w:pPr>
+        <w:rPr>
+          <w:b/>
+          <w:bCs/>
+          <w:lang w:val="en-US"/>
+        </w:rPr>
+      </w:pPr>
+    </w:p>
+    <w:p>
+      <w:pPr>
+        <w:rPr>
+          <w:b/>
+          <w:bCs/>
+          <w:lang w:val="en-US"/>
+        </w:rPr>
+      </w:pPr>
+    </w:p>
+    <w:p>
+      <w:pPr>
+        <w:rPr>
+          <w:b/>
+          <w:bCs/>
+          <w:lang w:val="en-US"/>
+        </w:rPr>
+      </w:pPr>
+    </w:p>
+    <w:p>
+      <w:pPr>
+        <w:rPr>
+          <w:b/>
+          <w:bCs/>
+          <w:lang w:val="en-US"/>
+        </w:rPr>
+      </w:pPr>
+    </w:p>
+    <w:p>
+      <w:pPr>
+        <w:rPr>
+          <w:b/>
+          <w:bCs/>
+          <w:lang w:val="en-US"/>
+        </w:rPr>
+      </w:pPr>
+    </w:p>
+    <w:p>
+      <w:pPr>
+        <w:rPr>
+          <w:b/>
+          <w:bCs/>
+          <w:lang w:val="en-US"/>
+        </w:rPr>
+      </w:pPr>
+    </w:p>
+    <w:p>
+      <w:pPr>
+        <w:rPr>
+          <w:b/>
+          <w:bCs/>
+          <w:lang w:val="en-US"/>
+        </w:rPr>
+      </w:pPr>
       <w:bookmarkStart w:id="0" w:name="_GoBack"/>
       <w:bookmarkEnd w:id="0"/>
       <w:r>
@@ -214,7 +1309,17 @@
           <w:bCs/>
           <w:lang w:val="en-US"/>
         </w:rPr>
-        <w:t>Lab</w:t>
+        <w:lastRenderedPageBreak/>
+        <w:t xml:space="preserve">Lab 0 Report: Setting Up </w:t>
+      </w:r>
+      <w:proofErr w:type="spellStart"/>
+      <w:r>
+        <w:rPr>
+          <w:b/>
+          <w:bCs/>
+          <w:lang w:val="en-US"/>
+        </w:rPr>
+        <w:t>CloudLab</w:t>
       </w:r>
       <w:proofErr w:type="spellEnd"/>
       <w:r>
@@ -223,6 +1328,160 @@
           <w:bCs/>
           <w:lang w:val="en-US"/>
         </w:rPr>
+        <w:t xml:space="preserve"> Environment</w:t>
+      </w:r>
+    </w:p>
+    <w:p>
+      <w:pPr>
+        <w:rPr>
+          <w:b/>
+          <w:bCs/>
+          <w:lang w:val="en-US"/>
+        </w:rPr>
+      </w:pPr>
+      <w:r>
+        <w:rPr>
+          <w:b/>
+          <w:bCs/>
+          <w:lang w:val="en-US"/>
+        </w:rPr>
+        <w:t>Introduction</w:t>
+      </w:r>
+    </w:p>
+    <w:p>
+      <w:pPr>
+        <w:rPr>
+          <w:lang w:val="en-US"/>
+        </w:rPr>
+      </w:pPr>
+      <w:r>
+        <w:rPr>
+          <w:lang w:val="en-US"/>
+        </w:rPr>
+        <w:t xml:space="preserve">This lab </w:t>
+      </w:r>
+      <w:proofErr w:type="gramStart"/>
+      <w:r>
+        <w:rPr>
+          <w:lang w:val="en-US"/>
+        </w:rPr>
+        <w:t>was aimed</w:t>
+      </w:r>
+      <w:proofErr w:type="gramEnd"/>
+      <w:r>
+        <w:rPr>
+          <w:lang w:val="en-US"/>
+        </w:rPr>
+        <w:t xml:space="preserve"> at helping us get started with the project infrastructure. The main goal was to ensure that all group members could access the required systems, set up accounts, and successfully run a basic </w:t>
+      </w:r>
+      <w:proofErr w:type="spellStart"/>
+      <w:r>
+        <w:rPr>
+          <w:lang w:val="en-US"/>
+        </w:rPr>
+        <w:t>CloudLab</w:t>
+      </w:r>
+      <w:proofErr w:type="spellEnd"/>
+      <w:r>
+        <w:rPr>
+          <w:lang w:val="en-US"/>
+        </w:rPr>
+        <w:t xml:space="preserve"> experiment. The lab also helped us understand teamwork, version control, and remote server access.</w:t>
+      </w:r>
+    </w:p>
+    <w:p>
+      <w:pPr>
+        <w:rPr>
+          <w:lang w:val="en-US"/>
+        </w:rPr>
+      </w:pPr>
+    </w:p>
+    <w:p>
+      <w:pPr>
+        <w:rPr>
+          <w:b/>
+          <w:bCs/>
+          <w:lang w:val="en-US"/>
+        </w:rPr>
+      </w:pPr>
+      <w:r>
+        <w:rPr>
+          <w:b/>
+          <w:bCs/>
+          <w:lang w:val="en-US"/>
+        </w:rPr>
+        <w:t>Group Setup and Collaboration</w:t>
+      </w:r>
+    </w:p>
+    <w:p>
+      <w:pPr>
+        <w:rPr>
+          <w:lang w:val="en-US"/>
+        </w:rPr>
+      </w:pPr>
+      <w:r>
+        <w:rPr>
+          <w:lang w:val="en-US"/>
+        </w:rPr>
+        <w:t>First, I confirmed my group members using the provided group spreadsheet. We also verified our gro</w:t>
+      </w:r>
+      <w:r>
+        <w:rPr>
+          <w:lang w:val="en-US"/>
+        </w:rPr>
+        <w:t>up email (e.g., csc26-daz</w:t>
+      </w:r>
+      <w:r>
+        <w:rPr>
+          <w:lang w:val="en-US"/>
+        </w:rPr>
+        <w:t>@cit.ac.ug) by sending a test email, and all members received it successfully.</w:t>
+      </w:r>
+    </w:p>
+    <w:p>
+      <w:pPr>
+        <w:rPr>
+          <w:lang w:val="en-US"/>
+        </w:rPr>
+      </w:pPr>
+      <w:r>
+        <w:rPr>
+          <w:lang w:val="en-US"/>
+        </w:rPr>
+        <w:t>To improve collaboration, we created a private GitHub repository and added all group members as collaborators. This allows us to share code, notes, and project files easily throughout the semester.</w:t>
+      </w:r>
+    </w:p>
+    <w:p>
+      <w:pPr>
+        <w:rPr>
+          <w:lang w:val="en-US"/>
+        </w:rPr>
+      </w:pPr>
+    </w:p>
+    <w:p>
+      <w:pPr>
+        <w:rPr>
+          <w:b/>
+          <w:bCs/>
+          <w:lang w:val="en-US"/>
+        </w:rPr>
+      </w:pPr>
+      <w:proofErr w:type="spellStart"/>
+      <w:r>
+        <w:rPr>
+          <w:b/>
+          <w:bCs/>
+          <w:lang w:val="en-US"/>
+        </w:rPr>
+        <w:t>CloudLab</w:t>
+      </w:r>
+      <w:proofErr w:type="spellEnd"/>
+      <w:r>
+        <w:rPr>
+          <w:b/>
+          <w:bCs/>
+          <w:lang w:val="en-US"/>
+        </w:rPr>
         <w:t xml:space="preserve"> Account Creation</w:t>
       </w:r>
     </w:p>
@@ -457,34 +1716,34 @@
         <w:rPr>
           <w:lang w:val="en-US"/>
         </w:rPr>
+        <w:t xml:space="preserve">We used SSH to log into the </w:t>
+      </w:r>
+      <w:proofErr w:type="spellStart"/>
+      <w:r>
+        <w:rPr>
+          <w:lang w:val="en-US"/>
+        </w:rPr>
+        <w:t>CloudLab</w:t>
+      </w:r>
+      <w:proofErr w:type="spellEnd"/>
+      <w:r>
+        <w:rPr>
+          <w:lang w:val="en-US"/>
+        </w:rPr>
+        <w:t xml:space="preserve"> machines. To make access easier, we set up an SSH authentication agent on our local machines. This allowed us to connect to multiple servers without entering passwords repeatedly.</w:t>
+      </w:r>
+    </w:p>
+    <w:p>
+      <w:pPr>
+        <w:rPr>
+          <w:lang w:val="en-US"/>
+        </w:rPr>
+      </w:pPr>
+      <w:r>
+        <w:rPr>
+          <w:lang w:val="en-US"/>
+        </w:rPr>
         <w:lastRenderedPageBreak/>
-        <w:t xml:space="preserve">We used SSH to log into the </w:t>
-      </w:r>
-      <w:proofErr w:type="spellStart"/>
-      <w:r>
-        <w:rPr>
-          <w:lang w:val="en-US"/>
-        </w:rPr>
-        <w:t>CloudLab</w:t>
-      </w:r>
-      <w:proofErr w:type="spellEnd"/>
-      <w:r>
-        <w:rPr>
-          <w:lang w:val="en-US"/>
-        </w:rPr>
-        <w:t xml:space="preserve"> machines. To make access easier, we set up an SSH authentication agent on our local machines. This allowed us to connect to multiple servers without entering passwords repeatedly.</w:t>
-      </w:r>
-    </w:p>
-    <w:p>
-      <w:pPr>
-        <w:rPr>
-          <w:lang w:val="en-US"/>
-        </w:rPr>
-      </w:pPr>
-      <w:r>
-        <w:rPr>
-          <w:lang w:val="en-US"/>
-        </w:rPr>
         <w:t xml:space="preserve">We used commands like </w:t>
       </w:r>
       <w:proofErr w:type="spellStart"/>
@@ -1236,6 +2495,7 @@
   <w:style w:type="character" w:default="1" w:styleId="DefaultParagraphFont">
     <w:name w:val="Default Paragraph Font"/>
     <w:uiPriority w:val="1"/>
+    <w:semiHidden/>
     <w:unhideWhenUsed/>
   </w:style>
   <w:style w:type="table" w:default="1" w:styleId="TableNormal">

</xml_diff>

<commit_message>
compling work to git
</commit_message>
<xml_diff>
--- a/Lab-0-Report.docx
+++ b/Lab-0-Report.docx
@@ -1,34 +1,24 @@
 
 <file path=word/document.xml><?xml version="1.0" encoding="utf-8"?>
-<w:document xmlns:wpc="http://schemas.microsoft.com/office/word/2010/wordprocessingCanvas" xmlns:cx="http://schemas.microsoft.com/office/drawing/2014/chartex" xmlns:cx1="http://schemas.microsoft.com/office/drawing/2015/9/8/chartex" xmlns:cx2="http://schemas.microsoft.com/office/drawing/2015/10/21/chartex" xmlns:cx3="http://schemas.microsoft.com/office/drawing/2016/5/9/chartex" xmlns:cx4="http://schemas.microsoft.com/office/drawing/2016/5/10/chartex" xmlns:cx5="http://schemas.microsoft.com/office/drawing/2016/5/11/chartex" xmlns:cx6="http://schemas.microsoft.com/office/drawing/2016/5/12/chartex" xmlns:cx7="http://schemas.microsoft.com/office/drawing/2016/5/13/chartex" xmlns:cx8="http://schemas.microsoft.com/office/drawing/2016/5/14/chartex" xmlns:mc="http://schemas.openxmlformats.org/markup-compatibility/2006" xmlns:aink="http://schemas.microsoft.com/office/drawing/2016/ink" xmlns:am3d="http://schemas.microsoft.com/office/drawing/2017/model3d" xmlns:o="urn:schemas-microsoft-com:office:office" xmlns:oel="http://schemas.microsoft.com/office/2019/extlst" xmlns:r="http://schemas.openxmlformats.org/officeDocument/2006/relationships" xmlns:m="http://schemas.openxmlformats.org/officeDocument/2006/math" xmlns:v="urn:schemas-microsoft-com:vml" xmlns:wp14="http://schemas.microsoft.com/office/word/2010/wordprocessingDrawing" xmlns:wp="http://schemas.openxmlformats.org/drawingml/2006/wordprocessingDrawing" xmlns:w10="urn:schemas-microsoft-com:office:word" xmlns:w="http://schemas.openxmlformats.org/wordprocessingml/2006/main" xmlns:w14="http://schemas.microsoft.com/office/word/2010/wordml" xmlns:w15="http://schemas.microsoft.com/office/word/2012/wordml" xmlns:w16cex="http://schemas.microsoft.com/office/word/2018/wordml/cex" xmlns:w16cid="http://schemas.microsoft.com/office/word/2016/wordml/cid" xmlns:w16="http://schemas.microsoft.com/office/word/2018/wordml" xmlns:w16du="http://schemas.microsoft.com/office/word/2023/wordml/word16du" xmlns:w16sdtdh="http://schemas.microsoft.com/office/word/2020/wordml/sdtdatahash" xmlns:w16se="http://schemas.microsoft.com/office/word/2015/wordml/symex" xmlns:wpg="http://schemas.microsoft.com/office/word/2010/wordprocessingGroup" xmlns:wpi="http://schemas.microsoft.com/office/word/2010/wordprocessingInk" xmlns:wne="http://schemas.microsoft.com/office/word/2006/wordml" xmlns:wps="http://schemas.microsoft.com/office/word/2010/wordprocessingShape" mc:Ignorable="w14 w15 w16se w16cid w16 w16cex w16sdtdh wp14">
+<w:document xmlns:wpc="http://schemas.microsoft.com/office/word/2010/wordprocessingCanvas" xmlns:cx="http://schemas.microsoft.com/office/drawing/2014/chartex" xmlns:cx1="http://schemas.microsoft.com/office/drawing/2015/9/8/chartex" xmlns:mc="http://schemas.openxmlformats.org/markup-compatibility/2006" xmlns:o="urn:schemas-microsoft-com:office:office" xmlns:r="http://schemas.openxmlformats.org/officeDocument/2006/relationships" xmlns:m="http://schemas.openxmlformats.org/officeDocument/2006/math" xmlns:v="urn:schemas-microsoft-com:vml" xmlns:wp14="http://schemas.microsoft.com/office/word/2010/wordprocessingDrawing" xmlns:wp="http://schemas.openxmlformats.org/drawingml/2006/wordprocessingDrawing" xmlns:w10="urn:schemas-microsoft-com:office:word" xmlns:w="http://schemas.openxmlformats.org/wordprocessingml/2006/main" xmlns:w14="http://schemas.microsoft.com/office/word/2010/wordml" xmlns:w15="http://schemas.microsoft.com/office/word/2012/wordml" xmlns:w16se="http://schemas.microsoft.com/office/word/2015/wordml/symex" xmlns:wpg="http://schemas.microsoft.com/office/word/2010/wordprocessingGroup" xmlns:wpi="http://schemas.microsoft.com/office/word/2010/wordprocessingInk" xmlns:wne="http://schemas.microsoft.com/office/word/2006/wordml" xmlns:wps="http://schemas.microsoft.com/office/word/2010/wordprocessingShape" mc:Ignorable="w14 w15 w16se wp14">
   <w:body>
     <w:p>
       <w:pPr>
         <w:jc w:val="center"/>
-        <w:rPr>
-          <w:lang w:val="en-US"/>
-        </w:rPr>
       </w:pPr>
     </w:p>
     <w:p>
       <w:pPr>
         <w:jc w:val="center"/>
-        <w:rPr>
-          <w:lang w:val="en-US"/>
-        </w:rPr>
       </w:pPr>
     </w:p>
     <w:p>
       <w:pPr>
         <w:jc w:val="center"/>
-        <w:rPr>
-          <w:lang w:val="en-US"/>
-        </w:rPr>
       </w:pPr>
       <w:r>
         <w:rPr>
           <w:noProof/>
-          <w:lang w:val="en-US"/>
         </w:rPr>
         <w:drawing>
           <wp:inline distT="0" distB="0" distL="0" distR="0" wp14:anchorId="2749C677" wp14:editId="544F797A">
@@ -149,7 +139,6 @@
           <w:rFonts w:ascii="Times New Roman" w:hAnsi="Times New Roman" w:cs="Times New Roman"/>
           <w:sz w:val="28"/>
           <w:szCs w:val="28"/>
-          <w:lang w:val="en-US"/>
         </w:rPr>
       </w:pPr>
       <w:r>
@@ -168,16 +157,36 @@
           <w:sz w:val="28"/>
           <w:szCs w:val="28"/>
         </w:rPr>
-        <w:t xml:space="preserve"> </w:t>
-      </w:r>
-      <w:r>
+        <w:t xml:space="preserve"> CLOUD COMPUTING</w:t>
+      </w:r>
+    </w:p>
+    <w:p>
+      <w:pPr>
+        <w:spacing w:line="360" w:lineRule="auto"/>
+        <w:jc w:val="center"/>
         <w:rPr>
           <w:rFonts w:ascii="Times New Roman" w:hAnsi="Times New Roman" w:cs="Times New Roman"/>
           <w:sz w:val="28"/>
           <w:szCs w:val="28"/>
-          <w:lang w:val="en-US"/>
-        </w:rPr>
-        <w:t>CLOUD COMPUTING</w:t>
+        </w:rPr>
+      </w:pPr>
+      <w:r>
+        <w:rPr>
+          <w:rFonts w:ascii="Times New Roman" w:hAnsi="Times New Roman" w:cs="Times New Roman"/>
+          <w:b/>
+          <w:bCs/>
+          <w:sz w:val="28"/>
+          <w:szCs w:val="28"/>
+        </w:rPr>
+        <w:t>ASSIGNMENT:</w:t>
+      </w:r>
+      <w:r>
+        <w:rPr>
+          <w:rFonts w:ascii="Times New Roman" w:hAnsi="Times New Roman" w:cs="Times New Roman"/>
+          <w:sz w:val="28"/>
+          <w:szCs w:val="28"/>
+        </w:rPr>
+        <w:t xml:space="preserve"> LAB 0</w:t>
       </w:r>
     </w:p>
     <w:p>
@@ -186,9 +195,10 @@
         <w:jc w:val="center"/>
         <w:rPr>
           <w:rFonts w:ascii="Times New Roman" w:hAnsi="Times New Roman" w:cs="Times New Roman"/>
+          <w:b/>
+          <w:bCs/>
           <w:sz w:val="28"/>
           <w:szCs w:val="28"/>
-          <w:lang w:val="en-US"/>
         </w:rPr>
       </w:pPr>
       <w:r>
@@ -199,72 +209,19 @@
           <w:sz w:val="28"/>
           <w:szCs w:val="28"/>
         </w:rPr>
-        <w:t>ASSIGNMENT:</w:t>
-      </w:r>
-      <w:r>
-        <w:rPr>
-          <w:rFonts w:ascii="Times New Roman" w:hAnsi="Times New Roman" w:cs="Times New Roman"/>
+        <w:t>GROUP: DAZ</w:t>
+      </w:r>
+    </w:p>
+    <w:p>
+      <w:pPr>
+        <w:spacing w:line="360" w:lineRule="auto"/>
+        <w:jc w:val="center"/>
+        <w:rPr>
+          <w:rFonts w:ascii="Times New Roman" w:hAnsi="Times New Roman" w:cs="Times New Roman"/>
+          <w:b/>
+          <w:bCs/>
           <w:sz w:val="28"/>
           <w:szCs w:val="28"/>
-        </w:rPr>
-        <w:t xml:space="preserve"> </w:t>
-      </w:r>
-      <w:r>
-        <w:rPr>
-          <w:rFonts w:ascii="Times New Roman" w:hAnsi="Times New Roman" w:cs="Times New Roman"/>
-          <w:sz w:val="28"/>
-          <w:szCs w:val="28"/>
-          <w:lang w:val="en-US"/>
-        </w:rPr>
-        <w:t>LAB 0</w:t>
-      </w:r>
-    </w:p>
-    <w:p>
-      <w:pPr>
-        <w:spacing w:line="360" w:lineRule="auto"/>
-        <w:jc w:val="center"/>
-        <w:rPr>
-          <w:rFonts w:ascii="Times New Roman" w:hAnsi="Times New Roman" w:cs="Times New Roman"/>
-          <w:b/>
-          <w:bCs/>
-          <w:sz w:val="28"/>
-          <w:szCs w:val="28"/>
-          <w:lang w:val="en-US"/>
-        </w:rPr>
-      </w:pPr>
-      <w:r>
-        <w:rPr>
-          <w:rFonts w:ascii="Times New Roman" w:hAnsi="Times New Roman" w:cs="Times New Roman"/>
-          <w:b/>
-          <w:bCs/>
-          <w:sz w:val="28"/>
-          <w:szCs w:val="28"/>
-        </w:rPr>
-        <w:t xml:space="preserve">GROUP: </w:t>
-      </w:r>
-      <w:r>
-        <w:rPr>
-          <w:rFonts w:ascii="Times New Roman" w:hAnsi="Times New Roman" w:cs="Times New Roman"/>
-          <w:b/>
-          <w:bCs/>
-          <w:sz w:val="28"/>
-          <w:szCs w:val="28"/>
-          <w:lang w:val="en-US"/>
-        </w:rPr>
-        <w:t>DAZ</w:t>
-      </w:r>
-    </w:p>
-    <w:p>
-      <w:pPr>
-        <w:spacing w:line="360" w:lineRule="auto"/>
-        <w:jc w:val="center"/>
-        <w:rPr>
-          <w:rFonts w:ascii="Times New Roman" w:hAnsi="Times New Roman" w:cs="Times New Roman"/>
-          <w:b/>
-          <w:bCs/>
-          <w:sz w:val="28"/>
-          <w:szCs w:val="28"/>
-          <w:lang w:val="en-US"/>
         </w:rPr>
       </w:pPr>
     </w:p>
@@ -279,11 +236,11 @@
         <w:tblLook w:val="04A0" w:firstRow="1" w:lastRow="0" w:firstColumn="1" w:lastColumn="0" w:noHBand="0" w:noVBand="1"/>
       </w:tblPr>
       <w:tblGrid>
-        <w:gridCol w:w="568"/>
-        <w:gridCol w:w="417"/>
-        <w:gridCol w:w="2976"/>
-        <w:gridCol w:w="1701"/>
-        <w:gridCol w:w="2694"/>
+        <w:gridCol w:w="598"/>
+        <w:gridCol w:w="415"/>
+        <w:gridCol w:w="2960"/>
+        <w:gridCol w:w="1697"/>
+        <w:gridCol w:w="2686"/>
       </w:tblGrid>
       <w:tr>
         <w:trPr>
@@ -317,7 +274,8 @@
                 <w:rFonts w:ascii="Roboto" w:eastAsia="Times New Roman" w:hAnsi="Roboto" w:cs="Arial"/>
                 <w:b/>
                 <w:bCs/>
-                <w:lang w:val="en-US"/>
+                <w:sz w:val="24"/>
+                <w:szCs w:val="24"/>
               </w:rPr>
             </w:pPr>
             <w:r>
@@ -325,7 +283,8 @@
                 <w:rFonts w:ascii="Roboto" w:eastAsia="Times New Roman" w:hAnsi="Roboto" w:cs="Arial"/>
                 <w:b/>
                 <w:bCs/>
-                <w:lang w:val="en-US"/>
+                <w:sz w:val="24"/>
+                <w:szCs w:val="24"/>
               </w:rPr>
               <w:t>DAZ</w:t>
             </w:r>
@@ -355,13 +314,15 @@
               <w:jc w:val="right"/>
               <w:rPr>
                 <w:rFonts w:ascii="Roboto" w:eastAsia="Times New Roman" w:hAnsi="Roboto" w:cs="Arial"/>
-                <w:lang w:val="en-US"/>
+                <w:sz w:val="24"/>
+                <w:szCs w:val="24"/>
               </w:rPr>
             </w:pPr>
             <w:r>
               <w:rPr>
                 <w:rFonts w:ascii="Roboto" w:eastAsia="Times New Roman" w:hAnsi="Roboto" w:cs="Arial"/>
-                <w:lang w:val="en-US"/>
+                <w:sz w:val="24"/>
+                <w:szCs w:val="24"/>
               </w:rPr>
               <w:t>1</w:t>
             </w:r>
@@ -390,13 +351,15 @@
               <w:spacing w:after="0" w:line="240" w:lineRule="auto"/>
               <w:rPr>
                 <w:rFonts w:ascii="Roboto" w:eastAsia="Times New Roman" w:hAnsi="Roboto" w:cs="Arial"/>
-                <w:lang w:val="en-US"/>
+                <w:sz w:val="24"/>
+                <w:szCs w:val="24"/>
               </w:rPr>
             </w:pPr>
             <w:r>
               <w:rPr>
                 <w:rFonts w:ascii="Roboto" w:eastAsia="Times New Roman" w:hAnsi="Roboto" w:cs="Arial"/>
-                <w:lang w:val="en-US"/>
+                <w:sz w:val="24"/>
+                <w:szCs w:val="24"/>
               </w:rPr>
               <w:t>Mwizerwa Timothy</w:t>
             </w:r>
@@ -426,13 +389,15 @@
               <w:jc w:val="center"/>
               <w:rPr>
                 <w:rFonts w:ascii="Roboto" w:eastAsia="Times New Roman" w:hAnsi="Roboto" w:cs="Arial"/>
-                <w:lang w:val="en-US"/>
+                <w:sz w:val="24"/>
+                <w:szCs w:val="24"/>
               </w:rPr>
             </w:pPr>
             <w:r>
               <w:rPr>
                 <w:rFonts w:ascii="Roboto" w:eastAsia="Times New Roman" w:hAnsi="Roboto" w:cs="Arial"/>
-                <w:lang w:val="en-US"/>
+                <w:sz w:val="24"/>
+                <w:szCs w:val="24"/>
               </w:rPr>
               <w:t>2400724330</w:t>
             </w:r>
@@ -462,13 +427,15 @@
               <w:jc w:val="center"/>
               <w:rPr>
                 <w:rFonts w:ascii="Roboto" w:eastAsia="Times New Roman" w:hAnsi="Roboto" w:cs="Arial"/>
-                <w:lang w:val="en-US"/>
+                <w:sz w:val="24"/>
+                <w:szCs w:val="24"/>
               </w:rPr>
             </w:pPr>
             <w:r>
               <w:rPr>
                 <w:rFonts w:ascii="Roboto" w:eastAsia="Times New Roman" w:hAnsi="Roboto" w:cs="Arial"/>
-                <w:lang w:val="en-US"/>
+                <w:sz w:val="24"/>
+                <w:szCs w:val="24"/>
               </w:rPr>
               <w:t>24/U/24330/PS</w:t>
             </w:r>
@@ -500,7 +467,8 @@
                 <w:rFonts w:ascii="Roboto" w:eastAsia="Times New Roman" w:hAnsi="Roboto" w:cs="Arial"/>
                 <w:b/>
                 <w:bCs/>
-                <w:lang w:val="en-US"/>
+                <w:sz w:val="24"/>
+                <w:szCs w:val="24"/>
               </w:rPr>
             </w:pPr>
           </w:p>
@@ -529,13 +497,15 @@
               <w:jc w:val="right"/>
               <w:rPr>
                 <w:rFonts w:ascii="Roboto" w:eastAsia="Times New Roman" w:hAnsi="Roboto" w:cs="Arial"/>
-                <w:lang w:val="en-US"/>
+                <w:sz w:val="24"/>
+                <w:szCs w:val="24"/>
               </w:rPr>
             </w:pPr>
             <w:r>
               <w:rPr>
                 <w:rFonts w:ascii="Roboto" w:eastAsia="Times New Roman" w:hAnsi="Roboto" w:cs="Arial"/>
-                <w:lang w:val="en-US"/>
+                <w:sz w:val="24"/>
+                <w:szCs w:val="24"/>
               </w:rPr>
               <w:t>2</w:t>
             </w:r>
@@ -564,13 +534,15 @@
               <w:spacing w:after="0" w:line="240" w:lineRule="auto"/>
               <w:rPr>
                 <w:rFonts w:ascii="Roboto" w:eastAsia="Times New Roman" w:hAnsi="Roboto" w:cs="Arial"/>
-                <w:lang w:val="en-US"/>
+                <w:sz w:val="24"/>
+                <w:szCs w:val="24"/>
               </w:rPr>
             </w:pPr>
             <w:r>
               <w:rPr>
                 <w:rFonts w:ascii="Roboto" w:eastAsia="Times New Roman" w:hAnsi="Roboto" w:cs="Arial"/>
-                <w:lang w:val="en-US"/>
+                <w:sz w:val="24"/>
+                <w:szCs w:val="24"/>
               </w:rPr>
               <w:t>Kinda Kelsey Naluwafu</w:t>
             </w:r>
@@ -600,13 +572,15 @@
               <w:jc w:val="center"/>
               <w:rPr>
                 <w:rFonts w:ascii="Roboto" w:eastAsia="Times New Roman" w:hAnsi="Roboto" w:cs="Arial"/>
-                <w:lang w:val="en-US"/>
+                <w:sz w:val="24"/>
+                <w:szCs w:val="24"/>
               </w:rPr>
             </w:pPr>
             <w:r>
               <w:rPr>
                 <w:rFonts w:ascii="Roboto" w:eastAsia="Times New Roman" w:hAnsi="Roboto" w:cs="Arial"/>
-                <w:lang w:val="en-US"/>
+                <w:sz w:val="24"/>
+                <w:szCs w:val="24"/>
               </w:rPr>
               <w:t>2400705862</w:t>
             </w:r>
@@ -636,13 +610,15 @@
               <w:jc w:val="center"/>
               <w:rPr>
                 <w:rFonts w:ascii="Roboto" w:eastAsia="Times New Roman" w:hAnsi="Roboto" w:cs="Arial"/>
-                <w:lang w:val="en-US"/>
+                <w:sz w:val="24"/>
+                <w:szCs w:val="24"/>
               </w:rPr>
             </w:pPr>
             <w:r>
               <w:rPr>
                 <w:rFonts w:ascii="Roboto" w:eastAsia="Times New Roman" w:hAnsi="Roboto" w:cs="Arial"/>
-                <w:lang w:val="en-US"/>
+                <w:sz w:val="24"/>
+                <w:szCs w:val="24"/>
               </w:rPr>
               <w:t>24/U/05862/PS</w:t>
             </w:r>
@@ -674,7 +650,8 @@
                 <w:rFonts w:ascii="Roboto" w:eastAsia="Times New Roman" w:hAnsi="Roboto" w:cs="Arial"/>
                 <w:b/>
                 <w:bCs/>
-                <w:lang w:val="en-US"/>
+                <w:sz w:val="24"/>
+                <w:szCs w:val="24"/>
               </w:rPr>
             </w:pPr>
           </w:p>
@@ -703,13 +680,15 @@
               <w:jc w:val="right"/>
               <w:rPr>
                 <w:rFonts w:ascii="Roboto" w:eastAsia="Times New Roman" w:hAnsi="Roboto" w:cs="Arial"/>
-                <w:lang w:val="en-US"/>
+                <w:sz w:val="24"/>
+                <w:szCs w:val="24"/>
               </w:rPr>
             </w:pPr>
             <w:r>
               <w:rPr>
                 <w:rFonts w:ascii="Roboto" w:eastAsia="Times New Roman" w:hAnsi="Roboto" w:cs="Arial"/>
-                <w:lang w:val="en-US"/>
+                <w:sz w:val="24"/>
+                <w:szCs w:val="24"/>
               </w:rPr>
               <w:t>3</w:t>
             </w:r>
@@ -738,13 +717,15 @@
               <w:spacing w:after="0" w:line="240" w:lineRule="auto"/>
               <w:rPr>
                 <w:rFonts w:ascii="Roboto" w:eastAsia="Times New Roman" w:hAnsi="Roboto" w:cs="Arial"/>
-                <w:lang w:val="en-US"/>
+                <w:sz w:val="24"/>
+                <w:szCs w:val="24"/>
               </w:rPr>
             </w:pPr>
             <w:r>
               <w:rPr>
                 <w:rFonts w:ascii="Roboto" w:eastAsia="Times New Roman" w:hAnsi="Roboto" w:cs="Arial"/>
-                <w:lang w:val="en-US"/>
+                <w:sz w:val="24"/>
+                <w:szCs w:val="24"/>
               </w:rPr>
               <w:t>Kato Adrian Mugerwa</w:t>
             </w:r>
@@ -774,13 +755,15 @@
               <w:jc w:val="center"/>
               <w:rPr>
                 <w:rFonts w:ascii="Roboto" w:eastAsia="Times New Roman" w:hAnsi="Roboto" w:cs="Arial"/>
-                <w:lang w:val="en-US"/>
+                <w:sz w:val="24"/>
+                <w:szCs w:val="24"/>
               </w:rPr>
             </w:pPr>
             <w:r>
               <w:rPr>
                 <w:rFonts w:ascii="Roboto" w:eastAsia="Times New Roman" w:hAnsi="Roboto" w:cs="Arial"/>
-                <w:lang w:val="en-US"/>
+                <w:sz w:val="24"/>
+                <w:szCs w:val="24"/>
               </w:rPr>
               <w:t>2400725909</w:t>
             </w:r>
@@ -810,13 +793,15 @@
               <w:jc w:val="center"/>
               <w:rPr>
                 <w:rFonts w:ascii="Roboto" w:eastAsia="Times New Roman" w:hAnsi="Roboto" w:cs="Arial"/>
-                <w:lang w:val="en-US"/>
+                <w:sz w:val="24"/>
+                <w:szCs w:val="24"/>
               </w:rPr>
             </w:pPr>
             <w:r>
               <w:rPr>
                 <w:rFonts w:ascii="Roboto" w:eastAsia="Times New Roman" w:hAnsi="Roboto" w:cs="Arial"/>
-                <w:lang w:val="en-US"/>
+                <w:sz w:val="24"/>
+                <w:szCs w:val="24"/>
               </w:rPr>
               <w:t>24/U/25909/PS</w:t>
             </w:r>
@@ -848,7 +833,8 @@
                 <w:rFonts w:ascii="Roboto" w:eastAsia="Times New Roman" w:hAnsi="Roboto" w:cs="Arial"/>
                 <w:b/>
                 <w:bCs/>
-                <w:lang w:val="en-US"/>
+                <w:sz w:val="24"/>
+                <w:szCs w:val="24"/>
               </w:rPr>
             </w:pPr>
           </w:p>
@@ -877,13 +863,15 @@
               <w:jc w:val="right"/>
               <w:rPr>
                 <w:rFonts w:ascii="Roboto" w:eastAsia="Times New Roman" w:hAnsi="Roboto" w:cs="Arial"/>
-                <w:lang w:val="en-US"/>
+                <w:sz w:val="24"/>
+                <w:szCs w:val="24"/>
               </w:rPr>
             </w:pPr>
             <w:r>
               <w:rPr>
                 <w:rFonts w:ascii="Roboto" w:eastAsia="Times New Roman" w:hAnsi="Roboto" w:cs="Arial"/>
-                <w:lang w:val="en-US"/>
+                <w:sz w:val="24"/>
+                <w:szCs w:val="24"/>
               </w:rPr>
               <w:t>4</w:t>
             </w:r>
@@ -912,13 +900,15 @@
               <w:spacing w:after="0" w:line="240" w:lineRule="auto"/>
               <w:rPr>
                 <w:rFonts w:ascii="Roboto" w:eastAsia="Times New Roman" w:hAnsi="Roboto" w:cs="Arial"/>
-                <w:lang w:val="en-US"/>
+                <w:sz w:val="24"/>
+                <w:szCs w:val="24"/>
               </w:rPr>
             </w:pPr>
             <w:r>
               <w:rPr>
                 <w:rFonts w:ascii="Roboto" w:eastAsia="Times New Roman" w:hAnsi="Roboto" w:cs="Arial"/>
-                <w:lang w:val="en-US"/>
+                <w:sz w:val="24"/>
+                <w:szCs w:val="24"/>
               </w:rPr>
               <w:t>Naluyima Pauline Oliver</w:t>
             </w:r>
@@ -948,13 +938,15 @@
               <w:jc w:val="center"/>
               <w:rPr>
                 <w:rFonts w:ascii="Roboto" w:eastAsia="Times New Roman" w:hAnsi="Roboto" w:cs="Arial"/>
-                <w:lang w:val="en-US"/>
+                <w:sz w:val="24"/>
+                <w:szCs w:val="24"/>
               </w:rPr>
             </w:pPr>
             <w:r>
               <w:rPr>
                 <w:rFonts w:ascii="Roboto" w:eastAsia="Times New Roman" w:hAnsi="Roboto" w:cs="Arial"/>
-                <w:lang w:val="en-US"/>
+                <w:sz w:val="24"/>
+                <w:szCs w:val="24"/>
               </w:rPr>
               <w:t>2400708847</w:t>
             </w:r>
@@ -984,13 +976,15 @@
               <w:jc w:val="center"/>
               <w:rPr>
                 <w:rFonts w:ascii="Roboto" w:eastAsia="Times New Roman" w:hAnsi="Roboto" w:cs="Arial"/>
-                <w:lang w:val="en-US"/>
+                <w:sz w:val="24"/>
+                <w:szCs w:val="24"/>
               </w:rPr>
             </w:pPr>
             <w:r>
               <w:rPr>
                 <w:rFonts w:ascii="Roboto" w:eastAsia="Times New Roman" w:hAnsi="Roboto" w:cs="Arial"/>
-                <w:lang w:val="en-US"/>
+                <w:sz w:val="24"/>
+                <w:szCs w:val="24"/>
               </w:rPr>
               <w:t>24/U/08847/PS</w:t>
             </w:r>
@@ -1022,7 +1016,8 @@
                 <w:rFonts w:ascii="Roboto" w:eastAsia="Times New Roman" w:hAnsi="Roboto" w:cs="Arial"/>
                 <w:b/>
                 <w:bCs/>
-                <w:lang w:val="en-US"/>
+                <w:sz w:val="24"/>
+                <w:szCs w:val="24"/>
               </w:rPr>
             </w:pPr>
           </w:p>
@@ -1051,13 +1046,15 @@
               <w:jc w:val="right"/>
               <w:rPr>
                 <w:rFonts w:ascii="Roboto" w:eastAsia="Times New Roman" w:hAnsi="Roboto" w:cs="Arial"/>
-                <w:lang w:val="en-US"/>
+                <w:sz w:val="24"/>
+                <w:szCs w:val="24"/>
               </w:rPr>
             </w:pPr>
             <w:r>
               <w:rPr>
                 <w:rFonts w:ascii="Roboto" w:eastAsia="Times New Roman" w:hAnsi="Roboto" w:cs="Arial"/>
-                <w:lang w:val="en-US"/>
+                <w:sz w:val="24"/>
+                <w:szCs w:val="24"/>
               </w:rPr>
               <w:t>5</w:t>
             </w:r>
@@ -1086,13 +1083,15 @@
               <w:spacing w:after="0" w:line="240" w:lineRule="auto"/>
               <w:rPr>
                 <w:rFonts w:ascii="Roboto" w:eastAsia="Times New Roman" w:hAnsi="Roboto" w:cs="Arial"/>
-                <w:lang w:val="en-US"/>
+                <w:sz w:val="24"/>
+                <w:szCs w:val="24"/>
               </w:rPr>
             </w:pPr>
             <w:r>
               <w:rPr>
                 <w:rFonts w:ascii="Roboto" w:eastAsia="Times New Roman" w:hAnsi="Roboto" w:cs="Arial"/>
-                <w:lang w:val="en-US"/>
+                <w:sz w:val="24"/>
+                <w:szCs w:val="24"/>
               </w:rPr>
               <w:t>Aroba Joseph</w:t>
             </w:r>
@@ -1122,13 +1121,15 @@
               <w:jc w:val="center"/>
               <w:rPr>
                 <w:rFonts w:ascii="Roboto" w:eastAsia="Times New Roman" w:hAnsi="Roboto" w:cs="Arial"/>
-                <w:lang w:val="en-US"/>
+                <w:sz w:val="24"/>
+                <w:szCs w:val="24"/>
               </w:rPr>
             </w:pPr>
             <w:r>
               <w:rPr>
                 <w:rFonts w:ascii="Roboto" w:eastAsia="Times New Roman" w:hAnsi="Roboto" w:cs="Arial"/>
-                <w:lang w:val="en-US"/>
+                <w:sz w:val="24"/>
+                <w:szCs w:val="24"/>
               </w:rPr>
               <w:t>2400703646</w:t>
             </w:r>
@@ -1158,13 +1159,15 @@
               <w:jc w:val="center"/>
               <w:rPr>
                 <w:rFonts w:ascii="Roboto" w:eastAsia="Times New Roman" w:hAnsi="Roboto" w:cs="Arial"/>
-                <w:lang w:val="en-US"/>
+                <w:sz w:val="24"/>
+                <w:szCs w:val="24"/>
               </w:rPr>
             </w:pPr>
             <w:r>
               <w:rPr>
                 <w:rFonts w:ascii="Roboto" w:eastAsia="Times New Roman" w:hAnsi="Roboto" w:cs="Arial"/>
-                <w:lang w:val="en-US"/>
+                <w:sz w:val="24"/>
+                <w:szCs w:val="24"/>
               </w:rPr>
               <w:t>24/U/03646/EVE</w:t>
             </w:r>
@@ -1179,69 +1182,59 @@
           <w:rFonts w:ascii="Times New Roman" w:hAnsi="Times New Roman" w:cs="Times New Roman"/>
           <w:b/>
           <w:bCs/>
-          <w:lang w:val="en-US"/>
         </w:rPr>
       </w:pPr>
     </w:p>
     <w:p>
       <w:pPr>
         <w:jc w:val="center"/>
-        <w:rPr>
-          <w:lang w:val="en-US"/>
-        </w:rPr>
-      </w:pPr>
-    </w:p>
-    <w:p>
-      <w:pPr>
-        <w:rPr>
-          <w:b/>
-          <w:bCs/>
-          <w:lang w:val="en-US"/>
-        </w:rPr>
-      </w:pPr>
-    </w:p>
-    <w:p>
-      <w:pPr>
-        <w:rPr>
-          <w:b/>
-          <w:bCs/>
-          <w:lang w:val="en-US"/>
-        </w:rPr>
-      </w:pPr>
-    </w:p>
-    <w:p>
-      <w:pPr>
-        <w:rPr>
-          <w:b/>
-          <w:bCs/>
-          <w:lang w:val="en-US"/>
-        </w:rPr>
-      </w:pPr>
-    </w:p>
-    <w:p>
-      <w:pPr>
-        <w:rPr>
-          <w:b/>
-          <w:bCs/>
-          <w:lang w:val="en-US"/>
-        </w:rPr>
-      </w:pPr>
-    </w:p>
-    <w:p>
-      <w:pPr>
-        <w:rPr>
-          <w:b/>
-          <w:bCs/>
-          <w:lang w:val="en-US"/>
-        </w:rPr>
-      </w:pPr>
-    </w:p>
-    <w:p>
-      <w:pPr>
-        <w:rPr>
-          <w:b/>
-          <w:bCs/>
-          <w:lang w:val="en-US"/>
+      </w:pPr>
+    </w:p>
+    <w:p>
+      <w:pPr>
+        <w:rPr>
+          <w:b/>
+          <w:bCs/>
+        </w:rPr>
+      </w:pPr>
+    </w:p>
+    <w:p>
+      <w:pPr>
+        <w:rPr>
+          <w:b/>
+          <w:bCs/>
+        </w:rPr>
+      </w:pPr>
+    </w:p>
+    <w:p>
+      <w:pPr>
+        <w:rPr>
+          <w:b/>
+          <w:bCs/>
+        </w:rPr>
+      </w:pPr>
+    </w:p>
+    <w:p>
+      <w:pPr>
+        <w:rPr>
+          <w:b/>
+          <w:bCs/>
+        </w:rPr>
+      </w:pPr>
+    </w:p>
+    <w:p>
+      <w:pPr>
+        <w:rPr>
+          <w:b/>
+          <w:bCs/>
+        </w:rPr>
+      </w:pPr>
+    </w:p>
+    <w:p>
+      <w:pPr>
+        <w:rPr>
+          <w:b/>
+          <w:bCs/>
         </w:rPr>
       </w:pPr>
     </w:p>
@@ -1253,15 +1246,13 @@
           <w:rFonts w:ascii="Times New Roman" w:hAnsi="Times New Roman" w:cs="Times New Roman"/>
           <w:b/>
           <w:bCs/>
-          <w:lang w:val="en-US"/>
-        </w:rPr>
-      </w:pPr>
-      <w:r>
-        <w:rPr>
-          <w:rFonts w:ascii="Times New Roman" w:hAnsi="Times New Roman" w:cs="Times New Roman"/>
-          <w:b/>
-          <w:bCs/>
-          <w:lang w:val="en-US"/>
+        </w:rPr>
+      </w:pPr>
+      <w:r>
+        <w:rPr>
+          <w:rFonts w:ascii="Times New Roman" w:hAnsi="Times New Roman" w:cs="Times New Roman"/>
+          <w:b/>
+          <w:bCs/>
         </w:rPr>
         <w:lastRenderedPageBreak/>
         <w:t>Lab 0 Report:</w:t>
@@ -1275,15 +1266,13 @@
           <w:rFonts w:ascii="Times New Roman" w:hAnsi="Times New Roman" w:cs="Times New Roman"/>
           <w:b/>
           <w:bCs/>
-          <w:lang w:val="en-US"/>
-        </w:rPr>
-      </w:pPr>
-      <w:r>
-        <w:rPr>
-          <w:rFonts w:ascii="Times New Roman" w:hAnsi="Times New Roman" w:cs="Times New Roman"/>
-          <w:b/>
-          <w:bCs/>
-          <w:lang w:val="en-US"/>
+        </w:rPr>
+      </w:pPr>
+      <w:r>
+        <w:rPr>
+          <w:rFonts w:ascii="Times New Roman" w:hAnsi="Times New Roman" w:cs="Times New Roman"/>
+          <w:b/>
+          <w:bCs/>
         </w:rPr>
         <w:t>Setting up CloudLab Environment</w:t>
       </w:r>
@@ -1299,7 +1288,6 @@
           <w:i/>
           <w:iCs/>
           <w:u w:val="single"/>
-          <w:lang w:val="en-US"/>
         </w:rPr>
       </w:pPr>
       <w:r>
@@ -1310,7 +1298,6 @@
           <w:i/>
           <w:iCs/>
           <w:u w:val="single"/>
-          <w:lang w:val="en-US"/>
         </w:rPr>
         <w:t>Introduction</w:t>
       </w:r>
@@ -1321,13 +1308,11 @@
         <w:jc w:val="both"/>
         <w:rPr>
           <w:rFonts w:ascii="Times New Roman" w:hAnsi="Times New Roman" w:cs="Times New Roman"/>
-          <w:lang w:val="en-US"/>
-        </w:rPr>
-      </w:pPr>
-      <w:r>
-        <w:rPr>
-          <w:rFonts w:ascii="Times New Roman" w:hAnsi="Times New Roman" w:cs="Times New Roman"/>
-          <w:lang w:val="en-US"/>
+        </w:rPr>
+      </w:pPr>
+      <w:r>
+        <w:rPr>
+          <w:rFonts w:ascii="Times New Roman" w:hAnsi="Times New Roman" w:cs="Times New Roman"/>
         </w:rPr>
         <w:t>This lab aimed at helping us get started with the project infrastructure. The main goal was to ensure that all group members could access the required systems, set up accounts, and successfully run a basic CloudLab experiment. The lab also helped us understand teamwork, version control, and remote server access.</w:t>
       </w:r>
@@ -1343,7 +1328,6 @@
           <w:i/>
           <w:iCs/>
           <w:u w:val="single"/>
-          <w:lang w:val="en-US"/>
         </w:rPr>
       </w:pPr>
       <w:r>
@@ -1354,7 +1338,6 @@
           <w:i/>
           <w:iCs/>
           <w:u w:val="single"/>
-          <w:lang w:val="en-US"/>
         </w:rPr>
         <w:t xml:space="preserve">Setup and Collaboration Group </w:t>
       </w:r>
@@ -1365,13 +1348,11 @@
         <w:jc w:val="both"/>
         <w:rPr>
           <w:rFonts w:ascii="Times New Roman" w:hAnsi="Times New Roman" w:cs="Times New Roman"/>
-          <w:lang w:val="en-US"/>
-        </w:rPr>
-      </w:pPr>
-      <w:r>
-        <w:rPr>
-          <w:rFonts w:ascii="Times New Roman" w:hAnsi="Times New Roman" w:cs="Times New Roman"/>
-          <w:lang w:val="en-US"/>
+        </w:rPr>
+      </w:pPr>
+      <w:r>
+        <w:rPr>
+          <w:rFonts w:ascii="Times New Roman" w:hAnsi="Times New Roman" w:cs="Times New Roman"/>
         </w:rPr>
         <w:t xml:space="preserve">First, we confirmed our group members using the provided group spreadsheet. We also verified our group email (e.g., csc26-daz@cit.ac.ug) by sending a test email, and all members received it successfully. To improve collaboration, we created a private GitHub repository and added all group members as collaborators “https://github.com/TIMOTHY-ctrl/cloud computing”. </w:t>
       </w:r>
@@ -1387,7 +1368,6 @@
           <w:i/>
           <w:iCs/>
           <w:u w:val="single"/>
-          <w:lang w:val="en-US"/>
         </w:rPr>
       </w:pPr>
       <w:r>
@@ -1398,7 +1378,6 @@
           <w:i/>
           <w:iCs/>
           <w:u w:val="single"/>
-          <w:lang w:val="en-US"/>
         </w:rPr>
         <w:t>CloudLab Account Creation</w:t>
       </w:r>
@@ -1409,13 +1388,11 @@
         <w:jc w:val="both"/>
         <w:rPr>
           <w:rFonts w:ascii="Times New Roman" w:hAnsi="Times New Roman" w:cs="Times New Roman"/>
-          <w:lang w:val="en-US"/>
-        </w:rPr>
-      </w:pPr>
-      <w:r>
-        <w:rPr>
-          <w:rFonts w:ascii="Times New Roman" w:hAnsi="Times New Roman" w:cs="Times New Roman"/>
-          <w:lang w:val="en-US"/>
+        </w:rPr>
+      </w:pPr>
+      <w:r>
+        <w:rPr>
+          <w:rFonts w:ascii="Times New Roman" w:hAnsi="Times New Roman" w:cs="Times New Roman"/>
         </w:rPr>
         <w:t>We created a CloudLab account using the group email and group ID as instructed. The required details included username, full name, email, and affiliation (Makerere University Kampala). We also uploaded an SSH public key for secure access to CloudLab machines.</w:t>
       </w:r>
@@ -1426,13 +1403,11 @@
         <w:jc w:val="both"/>
         <w:rPr>
           <w:rFonts w:ascii="Times New Roman" w:hAnsi="Times New Roman" w:cs="Times New Roman"/>
-          <w:lang w:val="en-US"/>
-        </w:rPr>
-      </w:pPr>
-      <w:r>
-        <w:rPr>
-          <w:rFonts w:ascii="Times New Roman" w:hAnsi="Times New Roman" w:cs="Times New Roman"/>
-          <w:lang w:val="en-US"/>
+        </w:rPr>
+      </w:pPr>
+      <w:r>
+        <w:rPr>
+          <w:rFonts w:ascii="Times New Roman" w:hAnsi="Times New Roman" w:cs="Times New Roman"/>
         </w:rPr>
         <w:t>After submitting the request and verifying the email, we waited for account approval. Once approved, we logged into the CloudLab dashboard successfully.</w:t>
       </w:r>
@@ -1448,7 +1423,6 @@
           <w:i/>
           <w:iCs/>
           <w:u w:val="single"/>
-          <w:lang w:val="en-US"/>
         </w:rPr>
       </w:pPr>
       <w:r>
@@ -1459,7 +1433,6 @@
           <w:i/>
           <w:iCs/>
           <w:u w:val="single"/>
-          <w:lang w:val="en-US"/>
         </w:rPr>
         <w:t>Initial Configuration</w:t>
       </w:r>
@@ -1470,13 +1443,11 @@
         <w:jc w:val="both"/>
         <w:rPr>
           <w:rFonts w:ascii="Times New Roman" w:hAnsi="Times New Roman" w:cs="Times New Roman"/>
-          <w:lang w:val="en-US"/>
-        </w:rPr>
-      </w:pPr>
-      <w:r>
-        <w:rPr>
-          <w:rFonts w:ascii="Times New Roman" w:hAnsi="Times New Roman" w:cs="Times New Roman"/>
-          <w:lang w:val="en-US"/>
+        </w:rPr>
+      </w:pPr>
+      <w:r>
+        <w:rPr>
+          <w:rFonts w:ascii="Times New Roman" w:hAnsi="Times New Roman" w:cs="Times New Roman"/>
         </w:rPr>
         <w:t xml:space="preserve">After logging in, we checked and confirmed that our SSH keys were properly added. We also changed the default shell to </w:t>
       </w:r>
@@ -1485,14 +1456,12 @@
           <w:rFonts w:ascii="Times New Roman" w:hAnsi="Times New Roman" w:cs="Times New Roman"/>
           <w:b/>
           <w:bCs/>
-          <w:lang w:val="en-US"/>
         </w:rPr>
         <w:t>bash</w:t>
       </w:r>
       <w:r>
         <w:rPr>
           <w:rFonts w:ascii="Times New Roman" w:hAnsi="Times New Roman" w:cs="Times New Roman"/>
-          <w:lang w:val="en-US"/>
         </w:rPr>
         <w:t>, as recommended for running scripts. This step ensures compatibility with most project scripts.</w:t>
       </w:r>
@@ -1508,7 +1477,6 @@
           <w:i/>
           <w:iCs/>
           <w:u w:val="single"/>
-          <w:lang w:val="en-US"/>
         </w:rPr>
       </w:pPr>
       <w:r>
@@ -1518,7 +1486,6 @@
           <w:iCs/>
           <w:noProof/>
           <w:u w:val="single"/>
-          <w:lang w:val="en-US"/>
         </w:rPr>
         <w:drawing>
           <wp:anchor distT="0" distB="0" distL="114300" distR="114300" simplePos="0" relativeHeight="251659264" behindDoc="1" locked="0" layoutInCell="1" allowOverlap="1" wp14:anchorId="0C4617A3" wp14:editId="78057984">
@@ -1602,7 +1569,6 @@
           <w:i/>
           <w:iCs/>
           <w:u w:val="single"/>
-          <w:lang w:val="en-US"/>
         </w:rPr>
         <w:t>Starting an Experiment</w:t>
       </w:r>
@@ -1613,20 +1579,17 @@
         <w:jc w:val="both"/>
         <w:rPr>
           <w:rFonts w:ascii="Times New Roman" w:hAnsi="Times New Roman" w:cs="Times New Roman"/>
-          <w:lang w:val="en-US"/>
-        </w:rPr>
-      </w:pPr>
-      <w:r>
-        <w:rPr>
-          <w:rFonts w:ascii="Times New Roman" w:hAnsi="Times New Roman" w:cs="Times New Roman"/>
-          <w:lang w:val="en-US"/>
+        </w:rPr>
+      </w:pPr>
+      <w:r>
+        <w:rPr>
+          <w:rFonts w:ascii="Times New Roman" w:hAnsi="Times New Roman" w:cs="Times New Roman"/>
         </w:rPr>
         <w:t>We started an experiment by selecting the project profile and choosing the Lab 0. We named the experiment using our group ID</w:t>
       </w:r>
       <w:r>
         <w:rPr>
           <w:rFonts w:ascii="Times New Roman" w:hAnsi="Times New Roman" w:cs="Times New Roman"/>
-          <w:lang w:val="en-US"/>
         </w:rPr>
         <w:t xml:space="preserve"> ‘</w:t>
       </w:r>
@@ -1634,7 +1597,6 @@
       <w:r>
         <w:rPr>
           <w:rFonts w:ascii="Times New Roman" w:hAnsi="Times New Roman" w:cs="Times New Roman"/>
-          <w:lang w:val="en-US"/>
         </w:rPr>
         <w:t>daz</w:t>
       </w:r>
@@ -1642,7 +1604,6 @@
       <w:r>
         <w:rPr>
           <w:rFonts w:ascii="Times New Roman" w:hAnsi="Times New Roman" w:cs="Times New Roman"/>
-          <w:lang w:val="en-US"/>
         </w:rPr>
         <w:t>’ and selected Utah cluster. After a few minutes, then experiment was successfully created.</w:t>
       </w:r>
@@ -1653,13 +1614,11 @@
         <w:jc w:val="both"/>
         <w:rPr>
           <w:rFonts w:ascii="Times New Roman" w:hAnsi="Times New Roman" w:cs="Times New Roman"/>
-          <w:lang w:val="en-US"/>
-        </w:rPr>
-      </w:pPr>
-      <w:r>
-        <w:rPr>
-          <w:rFonts w:ascii="Times New Roman" w:hAnsi="Times New Roman" w:cs="Times New Roman"/>
-          <w:lang w:val="en-US"/>
+        </w:rPr>
+      </w:pPr>
+      <w:r>
+        <w:rPr>
+          <w:rFonts w:ascii="Times New Roman" w:hAnsi="Times New Roman" w:cs="Times New Roman"/>
         </w:rPr>
         <w:t>The system automatically provided client and server machines. We accessed these machines using SSH commands provided on the dashboard once their status showed “Finished.”</w:t>
       </w:r>
@@ -1670,7 +1629,6 @@
         <w:jc w:val="both"/>
         <w:rPr>
           <w:rFonts w:ascii="Times New Roman" w:hAnsi="Times New Roman" w:cs="Times New Roman"/>
-          <w:lang w:val="en-US"/>
         </w:rPr>
       </w:pPr>
     </w:p>
@@ -1682,7 +1640,6 @@
           <w:rFonts w:ascii="Times New Roman" w:hAnsi="Times New Roman" w:cs="Times New Roman"/>
           <w:b/>
           <w:bCs/>
-          <w:lang w:val="en-US"/>
         </w:rPr>
       </w:pPr>
     </w:p>
@@ -1697,7 +1654,6 @@
           <w:i/>
           <w:iCs/>
           <w:u w:val="single"/>
-          <w:lang w:val="en-US"/>
         </w:rPr>
       </w:pPr>
       <w:r>
@@ -1708,7 +1664,6 @@
           <w:i/>
           <w:iCs/>
           <w:u w:val="single"/>
-          <w:lang w:val="en-US"/>
         </w:rPr>
         <w:t>SSH Access and Authentication Setup</w:t>
       </w:r>
@@ -1719,13 +1674,11 @@
         <w:jc w:val="both"/>
         <w:rPr>
           <w:rFonts w:ascii="Times New Roman" w:hAnsi="Times New Roman" w:cs="Times New Roman"/>
-          <w:lang w:val="en-US"/>
-        </w:rPr>
-      </w:pPr>
-      <w:r>
-        <w:rPr>
-          <w:rFonts w:ascii="Times New Roman" w:hAnsi="Times New Roman" w:cs="Times New Roman"/>
-          <w:lang w:val="en-US"/>
+        </w:rPr>
+      </w:pPr>
+      <w:r>
+        <w:rPr>
+          <w:rFonts w:ascii="Times New Roman" w:hAnsi="Times New Roman" w:cs="Times New Roman"/>
         </w:rPr>
         <w:t>We used SSH to log into the CloudLab machines. To make access easier, we set up an SSH authentication agent on our local machines. This allowed us to connect to multiple servers without entering passwords repeatedly.</w:t>
       </w:r>
@@ -1736,15 +1689,27 @@
         <w:jc w:val="both"/>
         <w:rPr>
           <w:rFonts w:ascii="Times New Roman" w:hAnsi="Times New Roman" w:cs="Times New Roman"/>
-          <w:lang w:val="en-US"/>
-        </w:rPr>
-      </w:pPr>
-      <w:r>
-        <w:rPr>
-          <w:rFonts w:ascii="Times New Roman" w:hAnsi="Times New Roman" w:cs="Times New Roman"/>
-          <w:lang w:val="en-US"/>
-        </w:rPr>
-        <w:t>We used commands like ssh-agent, ssh-add, and ssh -A to enable secure and smooth access across all nodes.</w:t>
+        </w:rPr>
+      </w:pPr>
+      <w:r>
+        <w:rPr>
+          <w:rFonts w:ascii="Times New Roman" w:hAnsi="Times New Roman" w:cs="Times New Roman"/>
+        </w:rPr>
+        <w:t xml:space="preserve">We used commands like ssh-agent, </w:t>
+      </w:r>
+      <w:proofErr w:type="gramStart"/>
+      <w:r>
+        <w:rPr>
+          <w:rFonts w:ascii="Times New Roman" w:hAnsi="Times New Roman" w:cs="Times New Roman"/>
+        </w:rPr>
+        <w:t>ssh-</w:t>
+      </w:r>
+      <w:proofErr w:type="gramEnd"/>
+      <w:r>
+        <w:rPr>
+          <w:rFonts w:ascii="Times New Roman" w:hAnsi="Times New Roman" w:cs="Times New Roman"/>
+        </w:rPr>
+        <w:t>add, and ssh -A to enable secure and smooth access across all nodes.</w:t>
       </w:r>
     </w:p>
     <w:p>
@@ -1753,9 +1718,98 @@
         <w:jc w:val="both"/>
         <w:rPr>
           <w:rFonts w:ascii="Times New Roman" w:hAnsi="Times New Roman" w:cs="Times New Roman"/>
-          <w:lang w:val="en-US"/>
-        </w:rPr>
-      </w:pPr>
+          <w:b/>
+          <w:bCs/>
+          <w:i/>
+          <w:iCs/>
+          <w:noProof/>
+          <w:u w:val="single"/>
+        </w:rPr>
+      </w:pPr>
+      <w:r>
+        <w:rPr>
+          <w:rFonts w:ascii="Times New Roman" w:hAnsi="Times New Roman" w:cs="Times New Roman"/>
+          <w:b/>
+          <w:bCs/>
+          <w:i/>
+          <w:iCs/>
+          <w:noProof/>
+          <w:u w:val="single"/>
+        </w:rPr>
+        <w:drawing>
+          <wp:anchor distT="0" distB="0" distL="114300" distR="114300" simplePos="0" relativeHeight="251660288" behindDoc="1" locked="0" layoutInCell="1" allowOverlap="1" wp14:anchorId="67B00946" wp14:editId="02601D56">
+            <wp:simplePos x="0" y="0"/>
+            <wp:positionH relativeFrom="column">
+              <wp:posOffset>0</wp:posOffset>
+            </wp:positionH>
+            <wp:positionV relativeFrom="paragraph">
+              <wp:posOffset>-1905</wp:posOffset>
+            </wp:positionV>
+            <wp:extent cx="2867025" cy="1285240"/>
+            <wp:effectExtent l="0" t="0" r="9525" b="0"/>
+            <wp:wrapTight wrapText="bothSides">
+              <wp:wrapPolygon edited="0">
+                <wp:start x="0" y="0"/>
+                <wp:lineTo x="0" y="21130"/>
+                <wp:lineTo x="21528" y="21130"/>
+                <wp:lineTo x="21528" y="0"/>
+                <wp:lineTo x="0" y="0"/>
+              </wp:wrapPolygon>
+            </wp:wrapTight>
+            <wp:docPr id="2" name="Picture 2" descr="C:\Users\CODEZ\Downloads\30.png"/>
+            <wp:cNvGraphicFramePr>
+              <a:graphicFrameLocks xmlns:a="http://schemas.openxmlformats.org/drawingml/2006/main" noChangeAspect="1"/>
+            </wp:cNvGraphicFramePr>
+            <a:graphic xmlns:a="http://schemas.openxmlformats.org/drawingml/2006/main">
+              <a:graphicData uri="http://schemas.openxmlformats.org/drawingml/2006/picture">
+                <pic:pic xmlns:pic="http://schemas.openxmlformats.org/drawingml/2006/picture">
+                  <pic:nvPicPr>
+                    <pic:cNvPr id="0" name="Picture 1" descr="C:\Users\CODEZ\Downloads\30.png"/>
+                    <pic:cNvPicPr>
+                      <a:picLocks noChangeAspect="1" noChangeArrowheads="1"/>
+                    </pic:cNvPicPr>
+                  </pic:nvPicPr>
+                  <pic:blipFill rotWithShape="1">
+                    <a:blip r:embed="rId7" cstate="print">
+                      <a:extLst>
+                        <a:ext uri="{28A0092B-C50C-407E-A947-70E740481C1C}">
+                          <a14:useLocalDpi xmlns:a14="http://schemas.microsoft.com/office/drawing/2010/main" val="0"/>
+                        </a:ext>
+                      </a:extLst>
+                    </a:blip>
+                    <a:srcRect t="32519" r="49950" b="21268"/>
+                    <a:stretch/>
+                  </pic:blipFill>
+                  <pic:spPr bwMode="auto">
+                    <a:xfrm>
+                      <a:off x="0" y="0"/>
+                      <a:ext cx="2867025" cy="1285240"/>
+                    </a:xfrm>
+                    <a:prstGeom prst="rect">
+                      <a:avLst/>
+                    </a:prstGeom>
+                    <a:noFill/>
+                    <a:ln>
+                      <a:noFill/>
+                    </a:ln>
+                    <a:extLst>
+                      <a:ext uri="{53640926-AAD7-44D8-BBD7-CCE9431645EC}">
+                        <a14:shadowObscured xmlns:a14="http://schemas.microsoft.com/office/drawing/2010/main"/>
+                      </a:ext>
+                    </a:extLst>
+                  </pic:spPr>
+                </pic:pic>
+              </a:graphicData>
+            </a:graphic>
+            <wp14:sizeRelH relativeFrom="page">
+              <wp14:pctWidth>0</wp14:pctWidth>
+            </wp14:sizeRelH>
+            <wp14:sizeRelV relativeFrom="page">
+              <wp14:pctHeight>0</wp14:pctHeight>
+            </wp14:sizeRelV>
+          </wp:anchor>
+        </w:drawing>
+      </w:r>
     </w:p>
     <w:p>
       <w:pPr>
@@ -1768,7 +1822,6 @@
           <w:i/>
           <w:iCs/>
           <w:u w:val="single"/>
-          <w:lang w:val="en-US"/>
         </w:rPr>
       </w:pPr>
       <w:r>
@@ -1779,7 +1832,6 @@
           <w:i/>
           <w:iCs/>
           <w:u w:val="single"/>
-          <w:lang w:val="en-US"/>
         </w:rPr>
         <w:t>Challenges Faced</w:t>
       </w:r>
@@ -1794,13 +1846,11 @@
         <w:jc w:val="both"/>
         <w:rPr>
           <w:rFonts w:ascii="Times New Roman" w:hAnsi="Times New Roman" w:cs="Times New Roman"/>
-          <w:lang w:val="en-US"/>
-        </w:rPr>
-      </w:pPr>
-      <w:r>
-        <w:rPr>
-          <w:rFonts w:ascii="Times New Roman" w:hAnsi="Times New Roman" w:cs="Times New Roman"/>
-          <w:lang w:val="en-US"/>
+        </w:rPr>
+      </w:pPr>
+      <w:r>
+        <w:rPr>
+          <w:rFonts w:ascii="Times New Roman" w:hAnsi="Times New Roman" w:cs="Times New Roman"/>
         </w:rPr>
         <w:t>Delay in account approval (waiting time)</w:t>
       </w:r>
@@ -1815,13 +1865,11 @@
         <w:jc w:val="both"/>
         <w:rPr>
           <w:rFonts w:ascii="Times New Roman" w:hAnsi="Times New Roman" w:cs="Times New Roman"/>
-          <w:lang w:val="en-US"/>
-        </w:rPr>
-      </w:pPr>
-      <w:r>
-        <w:rPr>
-          <w:rFonts w:ascii="Times New Roman" w:hAnsi="Times New Roman" w:cs="Times New Roman"/>
-          <w:lang w:val="en-US"/>
+        </w:rPr>
+      </w:pPr>
+      <w:r>
+        <w:rPr>
+          <w:rFonts w:ascii="Times New Roman" w:hAnsi="Times New Roman" w:cs="Times New Roman"/>
         </w:rPr>
         <w:t>Initial difficulty understanding SSH setup</w:t>
       </w:r>
@@ -1836,13 +1884,11 @@
         <w:jc w:val="both"/>
         <w:rPr>
           <w:rFonts w:ascii="Times New Roman" w:hAnsi="Times New Roman" w:cs="Times New Roman"/>
-          <w:lang w:val="en-US"/>
-        </w:rPr>
-      </w:pPr>
-      <w:r>
-        <w:rPr>
-          <w:rFonts w:ascii="Times New Roman" w:hAnsi="Times New Roman" w:cs="Times New Roman"/>
-          <w:lang w:val="en-US"/>
+        </w:rPr>
+      </w:pPr>
+      <w:r>
+        <w:rPr>
+          <w:rFonts w:ascii="Times New Roman" w:hAnsi="Times New Roman" w:cs="Times New Roman"/>
         </w:rPr>
         <w:t>Minor issues with SSH key configuration</w:t>
       </w:r>
@@ -1853,7 +1899,6 @@
         <w:jc w:val="both"/>
         <w:rPr>
           <w:rFonts w:ascii="Times New Roman" w:hAnsi="Times New Roman" w:cs="Times New Roman"/>
-          <w:lang w:val="en-US"/>
         </w:rPr>
       </w:pPr>
     </w:p>
@@ -1868,10 +1913,13 @@
           <w:i/>
           <w:iCs/>
           <w:u w:val="single"/>
-          <w:lang w:val="en-US"/>
-        </w:rPr>
-      </w:pPr>
-      <w:r>
+        </w:rPr>
+      </w:pPr>
+    </w:p>
+    <w:p>
+      <w:pPr>
+        <w:spacing w:after="0"/>
+        <w:jc w:val="both"/>
         <w:rPr>
           <w:rFonts w:ascii="Times New Roman" w:hAnsi="Times New Roman" w:cs="Times New Roman"/>
           <w:b/>
@@ -1879,78 +1927,45 @@
           <w:i/>
           <w:iCs/>
           <w:u w:val="single"/>
-          <w:lang w:val="en-US"/>
-        </w:rPr>
-        <w:t>Conclusion</w:t>
-      </w:r>
+        </w:rPr>
+      </w:pPr>
     </w:p>
     <w:p>
       <w:pPr>
         <w:spacing w:after="0"/>
         <w:jc w:val="both"/>
-        <w:rPr>
-          <w:rFonts w:ascii="Times New Roman" w:hAnsi="Times New Roman" w:cs="Times New Roman"/>
-          <w:lang w:val="en-US"/>
-        </w:rPr>
-      </w:pPr>
-      <w:r>
-        <w:rPr>
-          <w:rFonts w:ascii="Times New Roman" w:hAnsi="Times New Roman" w:cs="Times New Roman"/>
-          <w:lang w:val="en-US"/>
+      </w:pPr>
+      <w:r>
+        <w:rPr>
+          <w:rFonts w:ascii="Times New Roman" w:hAnsi="Times New Roman" w:cs="Times New Roman"/>
+          <w:b/>
+          <w:bCs/>
+          <w:i/>
+          <w:iCs/>
+          <w:u w:val="single"/>
+        </w:rPr>
+        <w:t>Conclusion</w:t>
+      </w:r>
+      <w:r>
+        <w:rPr>
+          <w:rFonts w:ascii="Times New Roman" w:hAnsi="Times New Roman" w:cs="Times New Roman"/>
+          <w:b/>
+          <w:bCs/>
+          <w:i/>
+          <w:iCs/>
+          <w:u w:val="single"/>
+        </w:rPr>
+        <w:t xml:space="preserve">: </w:t>
+      </w:r>
+      <w:r>
+        <w:rPr>
+          <w:rFonts w:ascii="Times New Roman" w:hAnsi="Times New Roman" w:cs="Times New Roman"/>
         </w:rPr>
         <w:t>Overall, the lab was successful. We were able to set up our CloudLab environment, collaborate as a group, and run our first experiment. This lab provided a strong foundation for future project tasks, especially in cloud computing, teamwork, and server management.</w:t>
       </w:r>
-    </w:p>
-    <w:p>
-      <w:pPr>
-        <w:spacing w:after="0"/>
-        <w:jc w:val="both"/>
-        <w:rPr>
-          <w:rFonts w:ascii="Times New Roman" w:hAnsi="Times New Roman" w:cs="Times New Roman"/>
-          <w:lang w:val="en-US"/>
-        </w:rPr>
-      </w:pPr>
-    </w:p>
-    <w:p>
-      <w:pPr>
-        <w:spacing w:after="0"/>
-        <w:jc w:val="both"/>
-        <w:rPr>
-          <w:rFonts w:ascii="Times New Roman" w:hAnsi="Times New Roman" w:cs="Times New Roman"/>
-          <w:lang w:val="en-US"/>
-        </w:rPr>
-      </w:pPr>
-    </w:p>
-    <w:p>
-      <w:pPr>
-        <w:spacing w:after="0"/>
-        <w:jc w:val="both"/>
-        <w:rPr>
-          <w:rFonts w:ascii="Times New Roman" w:hAnsi="Times New Roman" w:cs="Times New Roman"/>
-          <w:lang w:val="en-US"/>
-        </w:rPr>
-      </w:pPr>
-    </w:p>
-    <w:p>
-      <w:pPr>
-        <w:spacing w:after="0"/>
-        <w:jc w:val="both"/>
-        <w:rPr>
-          <w:rFonts w:ascii="Times New Roman" w:hAnsi="Times New Roman" w:cs="Times New Roman"/>
-          <w:b/>
-          <w:bCs/>
-          <w:lang w:val="en-US"/>
-        </w:rPr>
-      </w:pPr>
-    </w:p>
-    <w:p>
-      <w:pPr>
-        <w:rPr>
-          <w:lang w:val="en-US"/>
-        </w:rPr>
-      </w:pPr>
-    </w:p>
-    <w:p/>
+      <w:bookmarkStart w:id="0" w:name="_GoBack"/>
+      <w:bookmarkEnd w:id="0"/>
+    </w:p>
     <w:sectPr>
       <w:pgSz w:w="11906" w:h="16838"/>
       <w:pgMar w:top="1440" w:right="1440" w:bottom="1440" w:left="1440" w:header="708" w:footer="708" w:gutter="0"/>
@@ -1962,7 +1977,7 @@
 </file>
 
 <file path=word/numbering.xml><?xml version="1.0" encoding="utf-8"?>
-<w:numbering xmlns:wpc="http://schemas.microsoft.com/office/word/2010/wordprocessingCanvas" xmlns:cx="http://schemas.microsoft.com/office/drawing/2014/chartex" xmlns:cx1="http://schemas.microsoft.com/office/drawing/2015/9/8/chartex" xmlns:cx2="http://schemas.microsoft.com/office/drawing/2015/10/21/chartex" xmlns:cx3="http://schemas.microsoft.com/office/drawing/2016/5/9/chartex" xmlns:cx4="http://schemas.microsoft.com/office/drawing/2016/5/10/chartex" xmlns:cx5="http://schemas.microsoft.com/office/drawing/2016/5/11/chartex" xmlns:cx6="http://schemas.microsoft.com/office/drawing/2016/5/12/chartex" xmlns:cx7="http://schemas.microsoft.com/office/drawing/2016/5/13/chartex" xmlns:cx8="http://schemas.microsoft.com/office/drawing/2016/5/14/chartex" xmlns:mc="http://schemas.openxmlformats.org/markup-compatibility/2006" xmlns:aink="http://schemas.microsoft.com/office/drawing/2016/ink" xmlns:am3d="http://schemas.microsoft.com/office/drawing/2017/model3d" xmlns:o="urn:schemas-microsoft-com:office:office" xmlns:oel="http://schemas.microsoft.com/office/2019/extlst" xmlns:r="http://schemas.openxmlformats.org/officeDocument/2006/relationships" xmlns:m="http://schemas.openxmlformats.org/officeDocument/2006/math" xmlns:v="urn:schemas-microsoft-com:vml" xmlns:wp14="http://schemas.microsoft.com/office/word/2010/wordprocessingDrawing" xmlns:wp="http://schemas.openxmlformats.org/drawingml/2006/wordprocessingDrawing" xmlns:w10="urn:schemas-microsoft-com:office:word" xmlns:w="http://schemas.openxmlformats.org/wordprocessingml/2006/main" xmlns:w14="http://schemas.microsoft.com/office/word/2010/wordml" xmlns:w15="http://schemas.microsoft.com/office/word/2012/wordml" xmlns:w16cex="http://schemas.microsoft.com/office/word/2018/wordml/cex" xmlns:w16cid="http://schemas.microsoft.com/office/word/2016/wordml/cid" xmlns:w16="http://schemas.microsoft.com/office/word/2018/wordml" xmlns:w16du="http://schemas.microsoft.com/office/word/2023/wordml/word16du" xmlns:w16sdtdh="http://schemas.microsoft.com/office/word/2020/wordml/sdtdatahash" xmlns:w16se="http://schemas.microsoft.com/office/word/2015/wordml/symex" xmlns:wpg="http://schemas.microsoft.com/office/word/2010/wordprocessingGroup" xmlns:wpi="http://schemas.microsoft.com/office/word/2010/wordprocessingInk" xmlns:wne="http://schemas.microsoft.com/office/word/2006/wordml" xmlns:wps="http://schemas.microsoft.com/office/word/2010/wordprocessingShape" mc:Ignorable="w14 w15 w16se w16cid w16 w16cex w16sdtdh wp14">
+<w:numbering xmlns:wpc="http://schemas.microsoft.com/office/word/2010/wordprocessingCanvas" xmlns:cx="http://schemas.microsoft.com/office/drawing/2014/chartex" xmlns:cx1="http://schemas.microsoft.com/office/drawing/2015/9/8/chartex" xmlns:mc="http://schemas.openxmlformats.org/markup-compatibility/2006" xmlns:o="urn:schemas-microsoft-com:office:office" xmlns:r="http://schemas.openxmlformats.org/officeDocument/2006/relationships" xmlns:m="http://schemas.openxmlformats.org/officeDocument/2006/math" xmlns:v="urn:schemas-microsoft-com:vml" xmlns:wp14="http://schemas.microsoft.com/office/word/2010/wordprocessingDrawing" xmlns:wp="http://schemas.openxmlformats.org/drawingml/2006/wordprocessingDrawing" xmlns:w10="urn:schemas-microsoft-com:office:word" xmlns:w="http://schemas.openxmlformats.org/wordprocessingml/2006/main" xmlns:w14="http://schemas.microsoft.com/office/word/2010/wordml" xmlns:w15="http://schemas.microsoft.com/office/word/2012/wordml" xmlns:w16se="http://schemas.microsoft.com/office/word/2015/wordml/symex" xmlns:wpg="http://schemas.microsoft.com/office/word/2010/wordprocessingGroup" xmlns:wpi="http://schemas.microsoft.com/office/word/2010/wordprocessingInk" xmlns:wne="http://schemas.microsoft.com/office/word/2006/wordml" xmlns:wps="http://schemas.microsoft.com/office/word/2010/wordprocessingShape" mc:Ignorable="w14 w15 w16se wp14">
   <w:abstractNum w:abstractNumId="0" w15:restartNumberingAfterBreak="0">
     <w:nsid w:val="0EA577F3"/>
     <w:multiLevelType w:val="multilevel"/>
@@ -2112,21 +2127,21 @@
       </w:rPr>
     </w:lvl>
   </w:abstractNum>
-  <w:num w:numId="1" w16cid:durableId="1018774037">
+  <w:num w:numId="1">
     <w:abstractNumId w:val="0"/>
   </w:num>
 </w:numbering>
 </file>
 
 <file path=word/styles.xml><?xml version="1.0" encoding="utf-8"?>
-<w:styles xmlns:mc="http://schemas.openxmlformats.org/markup-compatibility/2006" xmlns:r="http://schemas.openxmlformats.org/officeDocument/2006/relationships" xmlns:w="http://schemas.openxmlformats.org/wordprocessingml/2006/main" xmlns:w14="http://schemas.microsoft.com/office/word/2010/wordml" xmlns:w15="http://schemas.microsoft.com/office/word/2012/wordml" xmlns:w16cex="http://schemas.microsoft.com/office/word/2018/wordml/cex" xmlns:w16cid="http://schemas.microsoft.com/office/word/2016/wordml/cid" xmlns:w16="http://schemas.microsoft.com/office/word/2018/wordml" xmlns:w16sdtdh="http://schemas.microsoft.com/office/word/2020/wordml/sdtdatahash" xmlns:w16se="http://schemas.microsoft.com/office/word/2015/wordml/symex" mc:Ignorable="w14 w15 w16se w16cid w16 w16cex w16sdtdh">
+<w:styles xmlns:mc="http://schemas.openxmlformats.org/markup-compatibility/2006" xmlns:r="http://schemas.openxmlformats.org/officeDocument/2006/relationships" xmlns:w="http://schemas.openxmlformats.org/wordprocessingml/2006/main" xmlns:w14="http://schemas.microsoft.com/office/word/2010/wordml" xmlns:w15="http://schemas.microsoft.com/office/word/2012/wordml" xmlns:w16se="http://schemas.microsoft.com/office/word/2015/wordml/symex" mc:Ignorable="w14 w15 w16se">
   <w:docDefaults>
     <w:rPrDefault>
       <w:rPr>
         <w:rFonts w:asciiTheme="minorHAnsi" w:eastAsiaTheme="minorHAnsi" w:hAnsiTheme="minorHAnsi" w:cstheme="minorBidi"/>
         <w:sz w:val="22"/>
         <w:szCs w:val="22"/>
-        <w:lang w:eastAsia="en-US" w:bidi="ar-SA"/>
+        <w:lang w:val="en-US" w:eastAsia="en-US" w:bidi="ar-SA"/>
       </w:rPr>
     </w:rPrDefault>
     <w:pPrDefault>
@@ -2135,7 +2150,7 @@
       </w:pPr>
     </w:pPrDefault>
   </w:docDefaults>
-  <w:latentStyles w:defLockedState="0" w:defUIPriority="99" w:defSemiHidden="0" w:defUnhideWhenUsed="0" w:defQFormat="0" w:count="376">
+  <w:latentStyles w:defLockedState="0" w:defUIPriority="99" w:defSemiHidden="0" w:defUnhideWhenUsed="0" w:defQFormat="0" w:count="371">
     <w:lsdException w:name="Normal" w:uiPriority="0" w:qFormat="1"/>
     <w:lsdException w:name="heading 1" w:uiPriority="9" w:qFormat="1"/>
     <w:lsdException w:name="heading 2" w:semiHidden="1" w:uiPriority="9" w:unhideWhenUsed="1" w:qFormat="1"/>
@@ -2241,6 +2256,7 @@
     <w:lsdException w:name="HTML Sample" w:semiHidden="1" w:unhideWhenUsed="1"/>
     <w:lsdException w:name="HTML Typewriter" w:semiHidden="1" w:unhideWhenUsed="1"/>
     <w:lsdException w:name="HTML Variable" w:semiHidden="1" w:unhideWhenUsed="1"/>
+    <w:lsdException w:name="Normal Table" w:semiHidden="1" w:unhideWhenUsed="1"/>
     <w:lsdException w:name="annotation subject" w:semiHidden="1" w:unhideWhenUsed="1"/>
     <w:lsdException w:name="No List" w:semiHidden="1" w:unhideWhenUsed="1"/>
     <w:lsdException w:name="Outline List 1" w:semiHidden="1" w:unhideWhenUsed="1"/>
@@ -2283,8 +2299,11 @@
     <w:lsdException w:name="Table Contemporary" w:semiHidden="1" w:unhideWhenUsed="1"/>
     <w:lsdException w:name="Table Elegant" w:semiHidden="1" w:unhideWhenUsed="1"/>
     <w:lsdException w:name="Table Professional" w:semiHidden="1" w:unhideWhenUsed="1"/>
+    <w:lsdException w:name="Table Subtle 1" w:semiHidden="1" w:unhideWhenUsed="1"/>
     <w:lsdException w:name="Table Subtle 2" w:semiHidden="1" w:unhideWhenUsed="1"/>
     <w:lsdException w:name="Table Web 1" w:semiHidden="1" w:unhideWhenUsed="1"/>
+    <w:lsdException w:name="Table Web 2" w:semiHidden="1" w:unhideWhenUsed="1"/>
+    <w:lsdException w:name="Table Web 3" w:semiHidden="1" w:unhideWhenUsed="1"/>
     <w:lsdException w:name="Balloon Text" w:semiHidden="1" w:unhideWhenUsed="1"/>
     <w:lsdException w:name="Table Grid" w:uiPriority="39"/>
     <w:lsdException w:name="Table Theme" w:semiHidden="1" w:unhideWhenUsed="1"/>
@@ -2503,11 +2522,6 @@
     <w:lsdException w:name="List Table 5 Dark Accent 6" w:uiPriority="50"/>
     <w:lsdException w:name="List Table 6 Colorful Accent 6" w:uiPriority="51"/>
     <w:lsdException w:name="List Table 7 Colorful Accent 6" w:uiPriority="52"/>
-    <w:lsdException w:name="Mention" w:semiHidden="1" w:unhideWhenUsed="1"/>
-    <w:lsdException w:name="Smart Hyperlink" w:semiHidden="1" w:unhideWhenUsed="1"/>
-    <w:lsdException w:name="Hashtag" w:semiHidden="1" w:unhideWhenUsed="1"/>
-    <w:lsdException w:name="Unresolved Mention" w:semiHidden="1" w:unhideWhenUsed="1"/>
-    <w:lsdException w:name="Smart Link" w:semiHidden="1" w:unhideWhenUsed="1"/>
   </w:latentStyles>
   <w:style w:type="paragraph" w:default="1" w:styleId="Normal">
     <w:name w:val="Normal"/>

</xml_diff>